<commit_message>
Day 8: deepen Materi to the plan's Wissen (rule 2.17) with real findings
All 12 Wissen bullets are now full: narrative thinking, transportation, goal gradient and endowed
progress, Freytag's structure, the GOV.UK one-question-per-page pattern with what it buys and costs,
Nielsen and Morkes on scanning, and the EU Digital Services Act Article 25. Day 8 added to
verify:depth; Word documents of Day 8 rebuilt.

Co-Authored-By: Claude Sonnet 5.5 <noreply@anthropic.com>
</commit_message>
<xml_diff>
--- a/docx/Day8-Materi-AION-UX-Developer-Storytelling-in-UX-UI-design.docx
+++ b/docx/Day8-Materi-AION-UX-Developer-Storytelling-in-UX-UI-design.docx
@@ -2777,6 +2777,319 @@
         <w:spacing w:before="0" w:after="80"/>
       </w:pPr>
     </w:p>
+    <w:p>
+      <w:pPr>
+        <w:spacing w:before="0" w:after="100"/>
+      </w:pPr>
+      <w:r>
+        <w:rPr>
+          <w:b/>
+        </w:rPr>
+        <w:t>Why people experience a process as a story: evidence</w:t>
+      </w:r>
+    </w:p>
+    <w:tbl>
+      <w:tblPr>
+        <w:tblW w:w="9638" w:type="dxa"/>
+        <w:tblBorders>
+          <w:top w:val="single" w:sz="4" w:space="0" w:color="D5DEE9"/>
+          <w:left w:val="single" w:sz="4" w:space="0" w:color="D5DEE9"/>
+          <w:bottom w:val="single" w:sz="4" w:space="0" w:color="D5DEE9"/>
+          <w:right w:val="single" w:sz="4" w:space="0" w:color="D5DEE9"/>
+          <w:insideH w:val="single" w:sz="4" w:space="0" w:color="D5DEE9"/>
+          <w:insideV w:val="single" w:sz="4" w:space="0" w:color="D5DEE9"/>
+        </w:tblBorders>
+        <w:tblLayout w:type="fixed"/>
+        <w:tblCellMar>
+          <w:top w:w="60" w:type="dxa"/>
+          <w:left w:w="100" w:type="dxa"/>
+          <w:bottom w:w="60" w:type="dxa"/>
+          <w:right w:w="100" w:type="dxa"/>
+        </w:tblCellMar>
+      </w:tblPr>
+      <w:tblGrid>
+        <w:gridCol w:w="1605"/>
+        <w:gridCol w:w="5112"/>
+        <w:gridCol w:w="2921"/>
+      </w:tblGrid>
+      <w:tr>
+        <w:trPr>
+          <w:cantSplit/>
+          <w:tblHeader/>
+        </w:trPr>
+        <w:tc>
+          <w:tcPr>
+            <w:tcW w:type="dxa" w:w="1605"/>
+            <w:shd w:val="clear" w:color="auto" w:fill="E6ECF4"/>
+          </w:tcPr>
+          <w:p>
+            <w:pPr>
+              <w:spacing w:before="0" w:after="0"/>
+            </w:pPr>
+            <w:r>
+              <w:rPr>
+                <w:b/>
+                <w:sz w:val="20"/>
+              </w:rPr>
+              <w:t>Idea</w:t>
+            </w:r>
+          </w:p>
+        </w:tc>
+        <w:tc>
+          <w:tcPr>
+            <w:tcW w:type="dxa" w:w="5112"/>
+            <w:shd w:val="clear" w:color="auto" w:fill="E6ECF4"/>
+          </w:tcPr>
+          <w:p>
+            <w:pPr>
+              <w:spacing w:before="0" w:after="0"/>
+            </w:pPr>
+            <w:r>
+              <w:rPr>
+                <w:b/>
+                <w:sz w:val="20"/>
+              </w:rPr>
+              <w:t>Real finding</w:t>
+            </w:r>
+          </w:p>
+        </w:tc>
+        <w:tc>
+          <w:tcPr>
+            <w:tcW w:type="dxa" w:w="2921"/>
+            <w:shd w:val="clear" w:color="auto" w:fill="E6ECF4"/>
+          </w:tcPr>
+          <w:p>
+            <w:pPr>
+              <w:spacing w:before="0" w:after="0"/>
+            </w:pPr>
+            <w:r>
+              <w:rPr>
+                <w:b/>
+                <w:sz w:val="20"/>
+              </w:rPr>
+              <w:t>What it means for a screen</w:t>
+            </w:r>
+          </w:p>
+        </w:tc>
+      </w:tr>
+      <w:tr>
+        <w:trPr>
+          <w:cantSplit/>
+        </w:trPr>
+        <w:tc>
+          <w:tcPr>
+            <w:tcW w:type="dxa" w:w="1605"/>
+          </w:tcPr>
+          <w:p>
+            <w:pPr>
+              <w:spacing w:before="0" w:after="0"/>
+            </w:pPr>
+            <w:r>
+              <w:rPr>
+                <w:sz w:val="20"/>
+              </w:rPr>
+              <w:t>Narrative as a way of thinking</w:t>
+            </w:r>
+          </w:p>
+        </w:tc>
+        <w:tc>
+          <w:tcPr>
+            <w:tcW w:type="dxa" w:w="5112"/>
+          </w:tcPr>
+          <w:p>
+            <w:pPr>
+              <w:spacing w:before="0" w:after="0"/>
+            </w:pPr>
+            <w:r>
+              <w:rPr>
+                <w:sz w:val="20"/>
+              </w:rPr>
+              <w:t>Jerome Bruner described narrative as one of two basic ways in which people order experience, next to logical argument (Bruner 1991).</w:t>
+            </w:r>
+          </w:p>
+        </w:tc>
+        <w:tc>
+          <w:tcPr>
+            <w:tcW w:type="dxa" w:w="2921"/>
+          </w:tcPr>
+          <w:p>
+            <w:pPr>
+              <w:spacing w:before="0" w:after="0"/>
+            </w:pPr>
+            <w:r>
+              <w:rPr>
+                <w:sz w:val="20"/>
+              </w:rPr>
+              <w:t>People make sense of a sequence of steps as “what happens to me”, whether or not the designer meant a story.</w:t>
+            </w:r>
+          </w:p>
+        </w:tc>
+      </w:tr>
+      <w:tr>
+        <w:trPr>
+          <w:cantSplit/>
+        </w:trPr>
+        <w:tc>
+          <w:tcPr>
+            <w:tcW w:type="dxa" w:w="1605"/>
+          </w:tcPr>
+          <w:p>
+            <w:pPr>
+              <w:spacing w:before="0" w:after="0"/>
+            </w:pPr>
+            <w:r>
+              <w:rPr>
+                <w:sz w:val="20"/>
+              </w:rPr>
+              <w:t>Absorption</w:t>
+            </w:r>
+          </w:p>
+        </w:tc>
+        <w:tc>
+          <w:tcPr>
+            <w:tcW w:type="dxa" w:w="5112"/>
+          </w:tcPr>
+          <w:p>
+            <w:pPr>
+              <w:spacing w:before="0" w:after="0"/>
+            </w:pPr>
+            <w:r>
+              <w:rPr>
+                <w:sz w:val="20"/>
+              </w:rPr>
+              <w:t>Green and Brock described transportation: absorption into a story through imagery, feeling and focused attention, which makes people more open to the story's view (Green and Brock 2000).</w:t>
+            </w:r>
+          </w:p>
+        </w:tc>
+        <w:tc>
+          <w:tcPr>
+            <w:tcW w:type="dxa" w:w="2921"/>
+          </w:tcPr>
+          <w:p>
+            <w:pPr>
+              <w:spacing w:before="0" w:after="0"/>
+            </w:pPr>
+            <w:r>
+              <w:rPr>
+                <w:sz w:val="20"/>
+              </w:rPr>
+              <w:t>A well-told step holds attention; the same effect can carry a message that has not been checked, so tell only what is true.</w:t>
+            </w:r>
+          </w:p>
+        </w:tc>
+      </w:tr>
+      <w:tr>
+        <w:trPr>
+          <w:cantSplit/>
+        </w:trPr>
+        <w:tc>
+          <w:tcPr>
+            <w:tcW w:type="dxa" w:w="1605"/>
+          </w:tcPr>
+          <w:p>
+            <w:pPr>
+              <w:spacing w:before="0" w:after="0"/>
+            </w:pPr>
+            <w:r>
+              <w:rPr>
+                <w:sz w:val="20"/>
+              </w:rPr>
+              <w:t>Progress pulls</w:t>
+            </w:r>
+          </w:p>
+        </w:tc>
+        <w:tc>
+          <w:tcPr>
+            <w:tcW w:type="dxa" w:w="5112"/>
+          </w:tcPr>
+          <w:p>
+            <w:pPr>
+              <w:spacing w:before="0" w:after="0"/>
+            </w:pPr>
+            <w:r>
+              <w:rPr>
+                <w:sz w:val="20"/>
+              </w:rPr>
+              <w:t>In a real café reward programme, customers bought coffee more often the closer they were to a free coffee, and customers who got a card with two stamps already filled in completed it faster (Kivetz et al. 2006).</w:t>
+            </w:r>
+          </w:p>
+        </w:tc>
+        <w:tc>
+          <w:tcPr>
+            <w:tcW w:type="dxa" w:w="2921"/>
+          </w:tcPr>
+          <w:p>
+            <w:pPr>
+              <w:spacing w:before="0" w:after="0"/>
+            </w:pPr>
+            <w:r>
+              <w:rPr>
+                <w:sz w:val="20"/>
+              </w:rPr>
+              <w:t>Show where the person is on the way, because the felt distance to the goal drives effort.</w:t>
+            </w:r>
+          </w:p>
+        </w:tc>
+      </w:tr>
+      <w:tr>
+        <w:trPr>
+          <w:cantSplit/>
+        </w:trPr>
+        <w:tc>
+          <w:tcPr>
+            <w:tcW w:type="dxa" w:w="1605"/>
+          </w:tcPr>
+          <w:p>
+            <w:pPr>
+              <w:spacing w:before="0" w:after="0"/>
+            </w:pPr>
+            <w:r>
+              <w:rPr>
+                <w:sz w:val="20"/>
+              </w:rPr>
+              <w:t>A head start</w:t>
+            </w:r>
+          </w:p>
+        </w:tc>
+        <w:tc>
+          <w:tcPr>
+            <w:tcW w:type="dxa" w:w="5112"/>
+          </w:tcPr>
+          <w:p>
+            <w:pPr>
+              <w:spacing w:before="0" w:after="0"/>
+            </w:pPr>
+            <w:r>
+              <w:rPr>
+                <w:sz w:val="20"/>
+              </w:rPr>
+              <w:t>At a car wash, customers who got a card that needed ten stamps with two filled in were compared with customers who got a card that needed eight (Nunes and Drèze 2006; the study is often quoted for its effect on completion).</w:t>
+            </w:r>
+          </w:p>
+        </w:tc>
+        <w:tc>
+          <w:tcPr>
+            <w:tcW w:type="dxa" w:w="2921"/>
+          </w:tcPr>
+          <w:p>
+            <w:pPr>
+              <w:spacing w:before="0" w:after="0"/>
+            </w:pPr>
+            <w:r>
+              <w:rPr>
+                <w:sz w:val="20"/>
+              </w:rPr>
+              <w:t>A visible head start makes a long path feel begun.</w:t>
+            </w:r>
+          </w:p>
+        </w:tc>
+      </w:tr>
+    </w:tbl>
+    <w:p>
+      <w:pPr>
+        <w:spacing w:before="0" w:after="80"/>
+      </w:pPr>
+    </w:p>
     <w:tbl>
       <w:tblPr>
         <w:tblW w:w="9598" w:type="dxa"/>
@@ -2826,7 +3139,7 @@
             </w:pPr>
             <w:r>
               <w:rPr/>
-              <w:t>Lantern Kitchens, Iris, Pavel, June and Arne are made up for this example. Narrative as a way of making sense of experience follows Bruner (1991); storytelling for user experience follows Quesenbery and Brooks (2010); design as a sequence with a beginning, tension and resolution follows Lupton (2017).</w:t>
+              <w:t>Lantern Kitchens, Iris, Pavel, June and Arne are made up for this example. Narrative as a way of making sense of experience follows Bruner (1991); storytelling for user experience follows Quesenbery and Brooks (2010); design as a sequence with a beginning, tension and resolution follows Lupton (2017). The findings in the table of real evidence are real research results, rules and cases; the sources are listed below.</w:t>
             </w:r>
           </w:p>
         </w:tc>
@@ -3015,7 +3328,7 @@
           <w:color w:val="556274"/>
           <w:sz w:val="18"/>
         </w:rPr>
-        <w:t>Bruner 1991 · Quesenbery &amp; Brooks 2010 · Lupton 2017</w:t>
+        <w:t>Bruner 1991 · Quesenbery &amp; Brooks 2010 · Lupton 2017 · Green &amp; Brock 2000 · Kivetz et al. 2006 · Nunes &amp; Drèze 2006</w:t>
       </w:r>
     </w:p>
     <w:p>
@@ -3667,6 +3980,319 @@
         <w:spacing w:before="0" w:after="80"/>
       </w:pPr>
     </w:p>
+    <w:p>
+      <w:pPr>
+        <w:spacing w:before="0" w:after="100"/>
+      </w:pPr>
+      <w:r>
+        <w:rPr>
+          <w:b/>
+        </w:rPr>
+        <w:t>The elements of narrative guidance: sources and use</w:t>
+      </w:r>
+    </w:p>
+    <w:tbl>
+      <w:tblPr>
+        <w:tblW w:w="9638" w:type="dxa"/>
+        <w:tblBorders>
+          <w:top w:val="single" w:sz="4" w:space="0" w:color="D5DEE9"/>
+          <w:left w:val="single" w:sz="4" w:space="0" w:color="D5DEE9"/>
+          <w:bottom w:val="single" w:sz="4" w:space="0" w:color="D5DEE9"/>
+          <w:right w:val="single" w:sz="4" w:space="0" w:color="D5DEE9"/>
+          <w:insideH w:val="single" w:sz="4" w:space="0" w:color="D5DEE9"/>
+          <w:insideV w:val="single" w:sz="4" w:space="0" w:color="D5DEE9"/>
+        </w:tblBorders>
+        <w:tblLayout w:type="fixed"/>
+        <w:tblCellMar>
+          <w:top w:w="60" w:type="dxa"/>
+          <w:left w:w="100" w:type="dxa"/>
+          <w:bottom w:w="60" w:type="dxa"/>
+          <w:right w:w="100" w:type="dxa"/>
+        </w:tblCellMar>
+      </w:tblPr>
+      <w:tblGrid>
+        <w:gridCol w:w="1594"/>
+        <w:gridCol w:w="4853"/>
+        <w:gridCol w:w="3191"/>
+      </w:tblGrid>
+      <w:tr>
+        <w:trPr>
+          <w:cantSplit/>
+          <w:tblHeader/>
+        </w:trPr>
+        <w:tc>
+          <w:tcPr>
+            <w:tcW w:type="dxa" w:w="1594"/>
+            <w:shd w:val="clear" w:color="auto" w:fill="E6ECF4"/>
+          </w:tcPr>
+          <w:p>
+            <w:pPr>
+              <w:spacing w:before="0" w:after="0"/>
+            </w:pPr>
+            <w:r>
+              <w:rPr>
+                <w:b/>
+                <w:sz w:val="20"/>
+              </w:rPr>
+              <w:t>Source</w:t>
+            </w:r>
+          </w:p>
+        </w:tc>
+        <w:tc>
+          <w:tcPr>
+            <w:tcW w:type="dxa" w:w="4853"/>
+            <w:shd w:val="clear" w:color="auto" w:fill="E6ECF4"/>
+          </w:tcPr>
+          <w:p>
+            <w:pPr>
+              <w:spacing w:before="0" w:after="0"/>
+            </w:pPr>
+            <w:r>
+              <w:rPr>
+                <w:b/>
+                <w:sz w:val="20"/>
+              </w:rPr>
+              <w:t>Real finding or example</w:t>
+            </w:r>
+          </w:p>
+        </w:tc>
+        <w:tc>
+          <w:tcPr>
+            <w:tcW w:type="dxa" w:w="3191"/>
+            <w:shd w:val="clear" w:color="auto" w:fill="E6ECF4"/>
+          </w:tcPr>
+          <w:p>
+            <w:pPr>
+              <w:spacing w:before="0" w:after="0"/>
+            </w:pPr>
+            <w:r>
+              <w:rPr>
+                <w:b/>
+                <w:sz w:val="20"/>
+              </w:rPr>
+              <w:t>What it means for a screen</w:t>
+            </w:r>
+          </w:p>
+        </w:tc>
+      </w:tr>
+      <w:tr>
+        <w:trPr>
+          <w:cantSplit/>
+        </w:trPr>
+        <w:tc>
+          <w:tcPr>
+            <w:tcW w:type="dxa" w:w="1594"/>
+          </w:tcPr>
+          <w:p>
+            <w:pPr>
+              <w:spacing w:before="0" w:after="0"/>
+            </w:pPr>
+            <w:r>
+              <w:rPr>
+                <w:sz w:val="20"/>
+              </w:rPr>
+              <w:t>Dramatic structure</w:t>
+            </w:r>
+          </w:p>
+        </w:tc>
+        <w:tc>
+          <w:tcPr>
+            <w:tcW w:type="dxa" w:w="4853"/>
+          </w:tcPr>
+          <w:p>
+            <w:pPr>
+              <w:spacing w:before="0" w:after="0"/>
+            </w:pPr>
+            <w:r>
+              <w:rPr>
+                <w:sz w:val="20"/>
+              </w:rPr>
+              <w:t>Gustav Freytag described a drama as a pyramid of exposition, rising action, climax, falling action and resolution (Freytag 1863).</w:t>
+            </w:r>
+          </w:p>
+        </w:tc>
+        <w:tc>
+          <w:tcPr>
+            <w:tcW w:type="dxa" w:w="3191"/>
+          </w:tcPr>
+          <w:p>
+            <w:pPr>
+              <w:spacing w:before="0" w:after="0"/>
+            </w:pPr>
+            <w:r>
+              <w:rPr>
+                <w:sz w:val="20"/>
+              </w:rPr>
+              <w:t>Start with the situation, build to the decision, and end with a clear resolution.</w:t>
+            </w:r>
+          </w:p>
+        </w:tc>
+      </w:tr>
+      <w:tr>
+        <w:trPr>
+          <w:cantSplit/>
+        </w:trPr>
+        <w:tc>
+          <w:tcPr>
+            <w:tcW w:type="dxa" w:w="1594"/>
+          </w:tcPr>
+          <w:p>
+            <w:pPr>
+              <w:spacing w:before="0" w:after="0"/>
+            </w:pPr>
+            <w:r>
+              <w:rPr>
+                <w:sz w:val="20"/>
+              </w:rPr>
+              <w:t>Stories in UX</w:t>
+            </w:r>
+          </w:p>
+        </w:tc>
+        <w:tc>
+          <w:tcPr>
+            <w:tcW w:type="dxa" w:w="4853"/>
+          </w:tcPr>
+          <w:p>
+            <w:pPr>
+              <w:spacing w:before="0" w:after="0"/>
+            </w:pPr>
+            <w:r>
+              <w:rPr>
+                <w:sz w:val="20"/>
+              </w:rPr>
+              <w:t>Quesenbery and Brooks describe how stories help teams and users with context, goals and obstacles (Quesenbery and Brooks 2010).</w:t>
+            </w:r>
+          </w:p>
+        </w:tc>
+        <w:tc>
+          <w:tcPr>
+            <w:tcW w:type="dxa" w:w="3191"/>
+          </w:tcPr>
+          <w:p>
+            <w:pPr>
+              <w:spacing w:before="0" w:after="0"/>
+            </w:pPr>
+            <w:r>
+              <w:rPr>
+                <w:sz w:val="20"/>
+              </w:rPr>
+              <w:t>Write the starting situation and the goal in the person's words, not the company's.</w:t>
+            </w:r>
+          </w:p>
+        </w:tc>
+      </w:tr>
+      <w:tr>
+        <w:trPr>
+          <w:cantSplit/>
+        </w:trPr>
+        <w:tc>
+          <w:tcPr>
+            <w:tcW w:type="dxa" w:w="1594"/>
+          </w:tcPr>
+          <w:p>
+            <w:pPr>
+              <w:spacing w:before="0" w:after="0"/>
+            </w:pPr>
+            <w:r>
+              <w:rPr>
+                <w:sz w:val="20"/>
+              </w:rPr>
+              <w:t>One step at a time</w:t>
+            </w:r>
+          </w:p>
+        </w:tc>
+        <w:tc>
+          <w:tcPr>
+            <w:tcW w:type="dxa" w:w="4853"/>
+          </w:tcPr>
+          <w:p>
+            <w:pPr>
+              <w:spacing w:before="0" w:after="0"/>
+            </w:pPr>
+            <w:r>
+              <w:rPr>
+                <w:sz w:val="20"/>
+              </w:rPr>
+              <w:t>The GOV.UK Design System asks, in its question pages pattern, to start with one question per page, so users understand what they are asked and can focus on it (GOV.UK Design System).</w:t>
+            </w:r>
+          </w:p>
+        </w:tc>
+        <w:tc>
+          <w:tcPr>
+            <w:tcW w:type="dxa" w:w="3191"/>
+          </w:tcPr>
+          <w:p>
+            <w:pPr>
+              <w:spacing w:before="0" w:after="0"/>
+            </w:pPr>
+            <w:r>
+              <w:rPr>
+                <w:sz w:val="20"/>
+              </w:rPr>
+              <w:t>A sequence gives a path with an end: each page is a step.</w:t>
+            </w:r>
+          </w:p>
+        </w:tc>
+      </w:tr>
+      <w:tr>
+        <w:trPr>
+          <w:cantSplit/>
+        </w:trPr>
+        <w:tc>
+          <w:tcPr>
+            <w:tcW w:type="dxa" w:w="1594"/>
+          </w:tcPr>
+          <w:p>
+            <w:pPr>
+              <w:spacing w:before="0" w:after="0"/>
+            </w:pPr>
+            <w:r>
+              <w:rPr>
+                <w:sz w:val="20"/>
+              </w:rPr>
+              <w:t>Progress</w:t>
+            </w:r>
+          </w:p>
+        </w:tc>
+        <w:tc>
+          <w:tcPr>
+            <w:tcW w:type="dxa" w:w="4853"/>
+          </w:tcPr>
+          <w:p>
+            <w:pPr>
+              <w:spacing w:before="0" w:after="0"/>
+            </w:pPr>
+            <w:r>
+              <w:rPr>
+                <w:sz w:val="20"/>
+              </w:rPr>
+              <w:t>Customers bought more often as they neared a reward (Kivetz et al. 2006).</w:t>
+            </w:r>
+          </w:p>
+        </w:tc>
+        <w:tc>
+          <w:tcPr>
+            <w:tcW w:type="dxa" w:w="3191"/>
+          </w:tcPr>
+          <w:p>
+            <w:pPr>
+              <w:spacing w:before="0" w:after="0"/>
+            </w:pPr>
+            <w:r>
+              <w:rPr>
+                <w:sz w:val="20"/>
+              </w:rPr>
+              <w:t>Show a path of stages with “you are here”.</w:t>
+            </w:r>
+          </w:p>
+        </w:tc>
+      </w:tr>
+    </w:tbl>
+    <w:p>
+      <w:pPr>
+        <w:spacing w:before="0" w:after="80"/>
+      </w:pPr>
+    </w:p>
     <w:tbl>
       <w:tblPr>
         <w:tblW w:w="9598" w:type="dxa"/>
@@ -3716,7 +4342,7 @@
             </w:pPr>
             <w:r>
               <w:rPr/>
-              <w:t>Lantern Kitchens, Iris, Pavel, June and Arne are made up for this example. The dramatic arc follows Freytag (1863); people speeding up as they see a goal come closer follows Kivetz et al. (2006).</w:t>
+              <w:t>Lantern Kitchens, Iris, Pavel, June and Arne are made up for this example. The dramatic arc follows Freytag (1863); people speeding up as they see a goal come closer follows Kivetz et al. (2006). The findings in the table of real evidence are real research results, rules and cases; the sources are listed below.</w:t>
             </w:r>
           </w:p>
         </w:tc>
@@ -3905,7 +4531,7 @@
           <w:color w:val="556274"/>
           <w:sz w:val="18"/>
         </w:rPr>
-        <w:t>Quesenbery &amp; Brooks 2010 · Freytag 1863 · Kivetz et al. 2006</w:t>
+        <w:t>Quesenbery &amp; Brooks 2010 · Freytag 1863 · Kivetz et al. 2006 · GOV.UK Design System, Question pages</w:t>
       </w:r>
     </w:p>
     <w:p>
@@ -4398,6 +5024,319 @@
         <w:spacing w:before="0" w:after="80"/>
       </w:pPr>
     </w:p>
+    <w:p>
+      <w:pPr>
+        <w:spacing w:before="0" w:after="100"/>
+      </w:pPr>
+      <w:r>
+        <w:rPr>
+          <w:b/>
+        </w:rPr>
+        <w:t>Narrative communication or narrative guidance: a real pattern</w:t>
+      </w:r>
+    </w:p>
+    <w:tbl>
+      <w:tblPr>
+        <w:tblW w:w="9638" w:type="dxa"/>
+        <w:tblBorders>
+          <w:top w:val="single" w:sz="4" w:space="0" w:color="D5DEE9"/>
+          <w:left w:val="single" w:sz="4" w:space="0" w:color="D5DEE9"/>
+          <w:bottom w:val="single" w:sz="4" w:space="0" w:color="D5DEE9"/>
+          <w:right w:val="single" w:sz="4" w:space="0" w:color="D5DEE9"/>
+          <w:insideH w:val="single" w:sz="4" w:space="0" w:color="D5DEE9"/>
+          <w:insideV w:val="single" w:sz="4" w:space="0" w:color="D5DEE9"/>
+        </w:tblBorders>
+        <w:tblLayout w:type="fixed"/>
+        <w:tblCellMar>
+          <w:top w:w="60" w:type="dxa"/>
+          <w:left w:w="100" w:type="dxa"/>
+          <w:bottom w:w="60" w:type="dxa"/>
+          <w:right w:w="100" w:type="dxa"/>
+        </w:tblCellMar>
+      </w:tblPr>
+      <w:tblGrid>
+        <w:gridCol w:w="1430"/>
+        <w:gridCol w:w="5537"/>
+        <w:gridCol w:w="2671"/>
+      </w:tblGrid>
+      <w:tr>
+        <w:trPr>
+          <w:cantSplit/>
+          <w:tblHeader/>
+        </w:trPr>
+        <w:tc>
+          <w:tcPr>
+            <w:tcW w:type="dxa" w:w="1430"/>
+            <w:shd w:val="clear" w:color="auto" w:fill="E6ECF4"/>
+          </w:tcPr>
+          <w:p>
+            <w:pPr>
+              <w:spacing w:before="0" w:after="0"/>
+            </w:pPr>
+            <w:r>
+              <w:rPr>
+                <w:b/>
+                <w:sz w:val="20"/>
+              </w:rPr>
+              <w:t>Topic</w:t>
+            </w:r>
+          </w:p>
+        </w:tc>
+        <w:tc>
+          <w:tcPr>
+            <w:tcW w:type="dxa" w:w="5537"/>
+            <w:shd w:val="clear" w:color="auto" w:fill="E6ECF4"/>
+          </w:tcPr>
+          <w:p>
+            <w:pPr>
+              <w:spacing w:before="0" w:after="0"/>
+            </w:pPr>
+            <w:r>
+              <w:rPr>
+                <w:b/>
+                <w:sz w:val="20"/>
+              </w:rPr>
+              <w:t>Real finding or example</w:t>
+            </w:r>
+          </w:p>
+        </w:tc>
+        <w:tc>
+          <w:tcPr>
+            <w:tcW w:type="dxa" w:w="2671"/>
+            <w:shd w:val="clear" w:color="auto" w:fill="E6ECF4"/>
+          </w:tcPr>
+          <w:p>
+            <w:pPr>
+              <w:spacing w:before="0" w:after="0"/>
+            </w:pPr>
+            <w:r>
+              <w:rPr>
+                <w:b/>
+                <w:sz w:val="20"/>
+              </w:rPr>
+              <w:t>What it means for a screen</w:t>
+            </w:r>
+          </w:p>
+        </w:tc>
+      </w:tr>
+      <w:tr>
+        <w:trPr>
+          <w:cantSplit/>
+        </w:trPr>
+        <w:tc>
+          <w:tcPr>
+            <w:tcW w:type="dxa" w:w="1430"/>
+          </w:tcPr>
+          <w:p>
+            <w:pPr>
+              <w:spacing w:before="0" w:after="0"/>
+            </w:pPr>
+            <w:r>
+              <w:rPr>
+                <w:sz w:val="20"/>
+              </w:rPr>
+              <w:t>A real pattern of guidance</w:t>
+            </w:r>
+          </w:p>
+        </w:tc>
+        <w:tc>
+          <w:tcPr>
+            <w:tcW w:type="dxa" w:w="5537"/>
+          </w:tcPr>
+          <w:p>
+            <w:pPr>
+              <w:spacing w:before="0" w:after="0"/>
+            </w:pPr>
+            <w:r>
+              <w:rPr>
+                <w:sz w:val="20"/>
+              </w:rPr>
+              <w:t>The GOV.UK Service Manual advises to split a form across several pages with each page containing just one thing (GOV.UK Service Manual, Form structure).</w:t>
+            </w:r>
+          </w:p>
+        </w:tc>
+        <w:tc>
+          <w:tcPr>
+            <w:tcW w:type="dxa" w:w="2671"/>
+          </w:tcPr>
+          <w:p>
+            <w:pPr>
+              <w:spacing w:before="0" w:after="0"/>
+            </w:pPr>
+            <w:r>
+              <w:rPr>
+                <w:sz w:val="20"/>
+              </w:rPr>
+              <w:t>Structure the journey by what the person decides now, page by page.</w:t>
+            </w:r>
+          </w:p>
+        </w:tc>
+      </w:tr>
+      <w:tr>
+        <w:trPr>
+          <w:cantSplit/>
+        </w:trPr>
+        <w:tc>
+          <w:tcPr>
+            <w:tcW w:type="dxa" w:w="1430"/>
+          </w:tcPr>
+          <w:p>
+            <w:pPr>
+              <w:spacing w:before="0" w:after="0"/>
+            </w:pPr>
+            <w:r>
+              <w:rPr>
+                <w:sz w:val="20"/>
+              </w:rPr>
+              <w:t>What it buys</w:t>
+            </w:r>
+          </w:p>
+        </w:tc>
+        <w:tc>
+          <w:tcPr>
+            <w:tcW w:type="dxa" w:w="5537"/>
+          </w:tcPr>
+          <w:p>
+            <w:pPr>
+              <w:spacing w:before="0" w:after="0"/>
+            </w:pPr>
+            <w:r>
+              <w:rPr>
+                <w:sz w:val="20"/>
+              </w:rPr>
+              <w:t>A 2015 GDS design note found the one-question-per-page layout better at handling errors, branches, loops and saving progress than the alternatives it compared (Government Digital Service 2015).</w:t>
+            </w:r>
+          </w:p>
+        </w:tc>
+        <w:tc>
+          <w:tcPr>
+            <w:tcW w:type="dxa" w:w="2671"/>
+          </w:tcPr>
+          <w:p>
+            <w:pPr>
+              <w:spacing w:before="0" w:after="0"/>
+            </w:pPr>
+            <w:r>
+              <w:rPr>
+                <w:sz w:val="20"/>
+              </w:rPr>
+              <w:t>The sequence is not only dramaturgy: it carries the logic of the process.</w:t>
+            </w:r>
+          </w:p>
+        </w:tc>
+      </w:tr>
+      <w:tr>
+        <w:trPr>
+          <w:cantSplit/>
+        </w:trPr>
+        <w:tc>
+          <w:tcPr>
+            <w:tcW w:type="dxa" w:w="1430"/>
+          </w:tcPr>
+          <w:p>
+            <w:pPr>
+              <w:spacing w:before="0" w:after="0"/>
+            </w:pPr>
+            <w:r>
+              <w:rPr>
+                <w:sz w:val="20"/>
+              </w:rPr>
+              <w:t>What it costs</w:t>
+            </w:r>
+          </w:p>
+        </w:tc>
+        <w:tc>
+          <w:tcPr>
+            <w:tcW w:type="dxa" w:w="5537"/>
+          </w:tcPr>
+          <w:p>
+            <w:pPr>
+              <w:spacing w:before="0" w:after="0"/>
+            </w:pPr>
+            <w:r>
+              <w:rPr>
+                <w:sz w:val="20"/>
+              </w:rPr>
+              <w:t>The pattern lengthens a form, so a service should only ask for what it needs (Scottish Government Design System; GOV.UK Design System).</w:t>
+            </w:r>
+          </w:p>
+        </w:tc>
+        <w:tc>
+          <w:tcPr>
+            <w:tcW w:type="dxa" w:w="2671"/>
+          </w:tcPr>
+          <w:p>
+            <w:pPr>
+              <w:spacing w:before="0" w:after="0"/>
+            </w:pPr>
+            <w:r>
+              <w:rPr>
+                <w:sz w:val="20"/>
+              </w:rPr>
+              <w:t>Count the pages: each transition needs a reason.</w:t>
+            </w:r>
+          </w:p>
+        </w:tc>
+      </w:tr>
+      <w:tr>
+        <w:trPr>
+          <w:cantSplit/>
+        </w:trPr>
+        <w:tc>
+          <w:tcPr>
+            <w:tcW w:type="dxa" w:w="1430"/>
+          </w:tcPr>
+          <w:p>
+            <w:pPr>
+              <w:spacing w:before="0" w:after="0"/>
+            </w:pPr>
+            <w:r>
+              <w:rPr>
+                <w:sz w:val="20"/>
+              </w:rPr>
+              <w:t>System status</w:t>
+            </w:r>
+          </w:p>
+        </w:tc>
+        <w:tc>
+          <w:tcPr>
+            <w:tcW w:type="dxa" w:w="5537"/>
+          </w:tcPr>
+          <w:p>
+            <w:pPr>
+              <w:spacing w:before="0" w:after="0"/>
+            </w:pPr>
+            <w:r>
+              <w:rPr>
+                <w:sz w:val="20"/>
+              </w:rPr>
+              <w:t>Keep users informed about what is going on, through appropriate feedback within a reasonable time (Nielsen 1994).</w:t>
+            </w:r>
+          </w:p>
+        </w:tc>
+        <w:tc>
+          <w:tcPr>
+            <w:tcW w:type="dxa" w:w="2671"/>
+          </w:tcPr>
+          <w:p>
+            <w:pPr>
+              <w:spacing w:before="0" w:after="0"/>
+            </w:pPr>
+            <w:r>
+              <w:rPr>
+                <w:sz w:val="20"/>
+              </w:rPr>
+              <w:t>Each transition says where you are and what comes next.</w:t>
+            </w:r>
+          </w:p>
+        </w:tc>
+      </w:tr>
+    </w:tbl>
+    <w:p>
+      <w:pPr>
+        <w:spacing w:before="0" w:after="80"/>
+      </w:pPr>
+    </w:p>
     <w:tbl>
       <w:tblPr>
         <w:tblW w:w="9598" w:type="dxa"/>
@@ -4447,7 +5386,7 @@
             </w:pPr>
             <w:r>
               <w:rPr/>
-              <w:t>Lantern Kitchens, Iris, Pavel, June and Arne are made up for this example. The dramatic arc follows Freytag (1863) and its use in design follows Lupton (2017); visibility of system status is Nielsen's heuristic (1994).</w:t>
+              <w:t>Lantern Kitchens, Iris, Pavel, June and Arne are made up for this example. The dramatic arc follows Freytag (1863) and its use in design follows Lupton (2017); visibility of system status is Nielsen's heuristic (1994). The findings in the table of real evidence are real research results, rules and cases; the sources are listed below.</w:t>
             </w:r>
           </w:p>
         </w:tc>
@@ -4636,7 +5575,7 @@
           <w:color w:val="556274"/>
           <w:sz w:val="18"/>
         </w:rPr>
-        <w:t>Lupton 2017 · Freytag 1863 · Nielsen 1994</w:t>
+        <w:t>Lupton 2017 · Freytag 1863 · Nielsen 1994 · GOV.UK Service Manual, Form structure · Government Digital Service 2015 · GOV.UK Design System, Question pages</w:t>
       </w:r>
     </w:p>
     <w:p>
@@ -5129,6 +6068,319 @@
         <w:spacing w:before="0" w:after="80"/>
       </w:pPr>
     </w:p>
+    <w:p>
+      <w:pPr>
+        <w:spacing w:before="0" w:after="100"/>
+      </w:pPr>
+      <w:r>
+        <w:rPr>
+          <w:b/>
+        </w:rPr>
+        <w:t>Orientation, motivation, memory and overload: findings</w:t>
+      </w:r>
+    </w:p>
+    <w:tbl>
+      <w:tblPr>
+        <w:tblW w:w="9638" w:type="dxa"/>
+        <w:tblBorders>
+          <w:top w:val="single" w:sz="4" w:space="0" w:color="D5DEE9"/>
+          <w:left w:val="single" w:sz="4" w:space="0" w:color="D5DEE9"/>
+          <w:bottom w:val="single" w:sz="4" w:space="0" w:color="D5DEE9"/>
+          <w:right w:val="single" w:sz="4" w:space="0" w:color="D5DEE9"/>
+          <w:insideH w:val="single" w:sz="4" w:space="0" w:color="D5DEE9"/>
+          <w:insideV w:val="single" w:sz="4" w:space="0" w:color="D5DEE9"/>
+        </w:tblBorders>
+        <w:tblLayout w:type="fixed"/>
+        <w:tblCellMar>
+          <w:top w:w="60" w:type="dxa"/>
+          <w:left w:w="100" w:type="dxa"/>
+          <w:bottom w:w="60" w:type="dxa"/>
+          <w:right w:w="100" w:type="dxa"/>
+        </w:tblCellMar>
+      </w:tblPr>
+      <w:tblGrid>
+        <w:gridCol w:w="1755"/>
+        <w:gridCol w:w="4297"/>
+        <w:gridCol w:w="3586"/>
+      </w:tblGrid>
+      <w:tr>
+        <w:trPr>
+          <w:cantSplit/>
+          <w:tblHeader/>
+        </w:trPr>
+        <w:tc>
+          <w:tcPr>
+            <w:tcW w:type="dxa" w:w="1755"/>
+            <w:shd w:val="clear" w:color="auto" w:fill="E6ECF4"/>
+          </w:tcPr>
+          <w:p>
+            <w:pPr>
+              <w:spacing w:before="0" w:after="0"/>
+            </w:pPr>
+            <w:r>
+              <w:rPr>
+                <w:b/>
+                <w:sz w:val="20"/>
+              </w:rPr>
+              <w:t>Effect</w:t>
+            </w:r>
+          </w:p>
+        </w:tc>
+        <w:tc>
+          <w:tcPr>
+            <w:tcW w:type="dxa" w:w="4297"/>
+            <w:shd w:val="clear" w:color="auto" w:fill="E6ECF4"/>
+          </w:tcPr>
+          <w:p>
+            <w:pPr>
+              <w:spacing w:before="0" w:after="0"/>
+            </w:pPr>
+            <w:r>
+              <w:rPr>
+                <w:b/>
+                <w:sz w:val="20"/>
+              </w:rPr>
+              <w:t>Real finding</w:t>
+            </w:r>
+          </w:p>
+        </w:tc>
+        <w:tc>
+          <w:tcPr>
+            <w:tcW w:type="dxa" w:w="3586"/>
+            <w:shd w:val="clear" w:color="auto" w:fill="E6ECF4"/>
+          </w:tcPr>
+          <w:p>
+            <w:pPr>
+              <w:spacing w:before="0" w:after="0"/>
+            </w:pPr>
+            <w:r>
+              <w:rPr>
+                <w:b/>
+                <w:sz w:val="20"/>
+              </w:rPr>
+              <w:t>What it means for a screen</w:t>
+            </w:r>
+          </w:p>
+        </w:tc>
+      </w:tr>
+      <w:tr>
+        <w:trPr>
+          <w:cantSplit/>
+        </w:trPr>
+        <w:tc>
+          <w:tcPr>
+            <w:tcW w:type="dxa" w:w="1755"/>
+          </w:tcPr>
+          <w:p>
+            <w:pPr>
+              <w:spacing w:before="0" w:after="0"/>
+            </w:pPr>
+            <w:r>
+              <w:rPr>
+                <w:sz w:val="20"/>
+              </w:rPr>
+              <w:t>Orientation</w:t>
+            </w:r>
+          </w:p>
+        </w:tc>
+        <w:tc>
+          <w:tcPr>
+            <w:tcW w:type="dxa" w:w="4297"/>
+          </w:tcPr>
+          <w:p>
+            <w:pPr>
+              <w:spacing w:before="0" w:after="0"/>
+            </w:pPr>
+            <w:r>
+              <w:rPr>
+                <w:sz w:val="20"/>
+              </w:rPr>
+              <w:t>A visitor should be able to tell at once where they are and what they can do (Krug 2014).</w:t>
+            </w:r>
+          </w:p>
+        </w:tc>
+        <w:tc>
+          <w:tcPr>
+            <w:tcW w:type="dxa" w:w="3586"/>
+          </w:tcPr>
+          <w:p>
+            <w:pPr>
+              <w:spacing w:before="0" w:after="0"/>
+            </w:pPr>
+            <w:r>
+              <w:rPr>
+                <w:sz w:val="20"/>
+              </w:rPr>
+              <w:t>Every step names its place in the journey.</w:t>
+            </w:r>
+          </w:p>
+        </w:tc>
+      </w:tr>
+      <w:tr>
+        <w:trPr>
+          <w:cantSplit/>
+        </w:trPr>
+        <w:tc>
+          <w:tcPr>
+            <w:tcW w:type="dxa" w:w="1755"/>
+          </w:tcPr>
+          <w:p>
+            <w:pPr>
+              <w:spacing w:before="0" w:after="0"/>
+            </w:pPr>
+            <w:r>
+              <w:rPr>
+                <w:sz w:val="20"/>
+              </w:rPr>
+              <w:t>Motivation</w:t>
+            </w:r>
+          </w:p>
+        </w:tc>
+        <w:tc>
+          <w:tcPr>
+            <w:tcW w:type="dxa" w:w="4297"/>
+          </w:tcPr>
+          <w:p>
+            <w:pPr>
+              <w:spacing w:before="0" w:after="0"/>
+            </w:pPr>
+            <w:r>
+              <w:rPr>
+                <w:sz w:val="20"/>
+              </w:rPr>
+              <w:t>Effort rises as the goal gets closer (Kivetz et al. 2006).</w:t>
+            </w:r>
+          </w:p>
+        </w:tc>
+        <w:tc>
+          <w:tcPr>
+            <w:tcW w:type="dxa" w:w="3586"/>
+          </w:tcPr>
+          <w:p>
+            <w:pPr>
+              <w:spacing w:before="0" w:after="0"/>
+            </w:pPr>
+            <w:r>
+              <w:rPr>
+                <w:sz w:val="20"/>
+              </w:rPr>
+              <w:t>Show progress early, and show how much is left.</w:t>
+            </w:r>
+          </w:p>
+        </w:tc>
+      </w:tr>
+      <w:tr>
+        <w:trPr>
+          <w:cantSplit/>
+        </w:trPr>
+        <w:tc>
+          <w:tcPr>
+            <w:tcW w:type="dxa" w:w="1755"/>
+          </w:tcPr>
+          <w:p>
+            <w:pPr>
+              <w:spacing w:before="0" w:after="0"/>
+            </w:pPr>
+            <w:r>
+              <w:rPr>
+                <w:sz w:val="20"/>
+              </w:rPr>
+              <w:t>Memory</w:t>
+            </w:r>
+          </w:p>
+        </w:tc>
+        <w:tc>
+          <w:tcPr>
+            <w:tcW w:type="dxa" w:w="4297"/>
+          </w:tcPr>
+          <w:p>
+            <w:pPr>
+              <w:spacing w:before="0" w:after="0"/>
+            </w:pPr>
+            <w:r>
+              <w:rPr>
+                <w:sz w:val="20"/>
+              </w:rPr>
+              <w:t>The end of an episode weighs more than its length in the memory of it (Kahneman et al. 1993, as reported).</w:t>
+            </w:r>
+          </w:p>
+        </w:tc>
+        <w:tc>
+          <w:tcPr>
+            <w:tcW w:type="dxa" w:w="3586"/>
+          </w:tcPr>
+          <w:p>
+            <w:pPr>
+              <w:spacing w:before="0" w:after="0"/>
+            </w:pPr>
+            <w:r>
+              <w:rPr>
+                <w:sz w:val="20"/>
+              </w:rPr>
+              <w:t>Give the journey a real ending: the result, and the next step.</w:t>
+            </w:r>
+          </w:p>
+        </w:tc>
+      </w:tr>
+      <w:tr>
+        <w:trPr>
+          <w:cantSplit/>
+        </w:trPr>
+        <w:tc>
+          <w:tcPr>
+            <w:tcW w:type="dxa" w:w="1755"/>
+          </w:tcPr>
+          <w:p>
+            <w:pPr>
+              <w:spacing w:before="0" w:after="0"/>
+            </w:pPr>
+            <w:r>
+              <w:rPr>
+                <w:sz w:val="20"/>
+              </w:rPr>
+              <w:t>Overload</w:t>
+            </w:r>
+          </w:p>
+        </w:tc>
+        <w:tc>
+          <w:tcPr>
+            <w:tcW w:type="dxa" w:w="4297"/>
+          </w:tcPr>
+          <w:p>
+            <w:pPr>
+              <w:spacing w:before="0" w:after="0"/>
+            </w:pPr>
+            <w:r>
+              <w:rPr>
+                <w:sz w:val="20"/>
+              </w:rPr>
+              <w:t>79% of users always scanned a new page (Nielsen and Morkes 1997).</w:t>
+            </w:r>
+          </w:p>
+        </w:tc>
+        <w:tc>
+          <w:tcPr>
+            <w:tcW w:type="dxa" w:w="3586"/>
+          </w:tcPr>
+          <w:p>
+            <w:pPr>
+              <w:spacing w:before="0" w:after="0"/>
+            </w:pPr>
+            <w:r>
+              <w:rPr>
+                <w:sz w:val="20"/>
+              </w:rPr>
+              <w:t>A scene that must be read before the task starts will be skipped; keep the story to a line or two inside the task.</w:t>
+            </w:r>
+          </w:p>
+        </w:tc>
+      </w:tr>
+    </w:tbl>
+    <w:p>
+      <w:pPr>
+        <w:spacing w:before="0" w:after="80"/>
+      </w:pPr>
+    </w:p>
     <w:tbl>
       <w:tblPr>
         <w:tblW w:w="9598" w:type="dxa"/>
@@ -5178,7 +6430,7 @@
             </w:pPr>
             <w:r>
               <w:rPr/>
-              <w:t>Lantern Kitchens, Iris, Pavel, June and Arne are made up for this example. Being absorbed in a story and moved by it follows Green and Brock (2000); the goal-gradient effect follows Kivetz et al. (2006); not making people think follows Krug (2014).</w:t>
+              <w:t>Lantern Kitchens, Iris, Pavel, June and Arne are made up for this example. Being absorbed in a story and moved by it follows Green and Brock (2000); the goal-gradient effect follows Kivetz et al. (2006); not making people think follows Krug (2014). The findings in the table of real evidence are real research results, rules and cases; the sources are listed below.</w:t>
             </w:r>
           </w:p>
         </w:tc>
@@ -5367,7 +6619,7 @@
           <w:color w:val="556274"/>
           <w:sz w:val="18"/>
         </w:rPr>
-        <w:t>Green &amp; Brock 2000 · Kivetz et al. 2006 · Krug 2014</w:t>
+        <w:t>Green &amp; Brock 2000 · Kivetz et al. 2006 · Krug 2014 · Kahneman et al. 1993 · Nielsen 1997</w:t>
       </w:r>
     </w:p>
     <w:p>
@@ -5602,6 +6854,266 @@
         <w:t>Figure 6 · Lantern Kitchens weighs three measures on effect on users, feasibility, risk and time pressure.</w:t>
       </w:r>
     </w:p>
+    <w:p>
+      <w:pPr>
+        <w:spacing w:before="0" w:after="100"/>
+      </w:pPr>
+      <w:r>
+        <w:rPr>
+          <w:b/>
+        </w:rPr>
+        <w:t>Embedding an action in its context: findings</w:t>
+      </w:r>
+    </w:p>
+    <w:tbl>
+      <w:tblPr>
+        <w:tblW w:w="9638" w:type="dxa"/>
+        <w:tblBorders>
+          <w:top w:val="single" w:sz="4" w:space="0" w:color="D5DEE9"/>
+          <w:left w:val="single" w:sz="4" w:space="0" w:color="D5DEE9"/>
+          <w:bottom w:val="single" w:sz="4" w:space="0" w:color="D5DEE9"/>
+          <w:right w:val="single" w:sz="4" w:space="0" w:color="D5DEE9"/>
+          <w:insideH w:val="single" w:sz="4" w:space="0" w:color="D5DEE9"/>
+          <w:insideV w:val="single" w:sz="4" w:space="0" w:color="D5DEE9"/>
+        </w:tblBorders>
+        <w:tblLayout w:type="fixed"/>
+        <w:tblCellMar>
+          <w:top w:w="60" w:type="dxa"/>
+          <w:left w:w="100" w:type="dxa"/>
+          <w:bottom w:w="60" w:type="dxa"/>
+          <w:right w:w="100" w:type="dxa"/>
+        </w:tblCellMar>
+      </w:tblPr>
+      <w:tblGrid>
+        <w:gridCol w:w="1998"/>
+        <w:gridCol w:w="3701"/>
+        <w:gridCol w:w="3939"/>
+      </w:tblGrid>
+      <w:tr>
+        <w:trPr>
+          <w:cantSplit/>
+          <w:tblHeader/>
+        </w:trPr>
+        <w:tc>
+          <w:tcPr>
+            <w:tcW w:type="dxa" w:w="1998"/>
+            <w:shd w:val="clear" w:color="auto" w:fill="E6ECF4"/>
+          </w:tcPr>
+          <w:p>
+            <w:pPr>
+              <w:spacing w:before="0" w:after="0"/>
+            </w:pPr>
+            <w:r>
+              <w:rPr>
+                <w:b/>
+                <w:sz w:val="20"/>
+              </w:rPr>
+              <w:t>Finding</w:t>
+            </w:r>
+          </w:p>
+        </w:tc>
+        <w:tc>
+          <w:tcPr>
+            <w:tcW w:type="dxa" w:w="3701"/>
+            <w:shd w:val="clear" w:color="auto" w:fill="E6ECF4"/>
+          </w:tcPr>
+          <w:p>
+            <w:pPr>
+              <w:spacing w:before="0" w:after="0"/>
+            </w:pPr>
+            <w:r>
+              <w:rPr>
+                <w:b/>
+                <w:sz w:val="20"/>
+              </w:rPr>
+              <w:t>What it shows</w:t>
+            </w:r>
+          </w:p>
+        </w:tc>
+        <w:tc>
+          <w:tcPr>
+            <w:tcW w:type="dxa" w:w="3939"/>
+            <w:shd w:val="clear" w:color="auto" w:fill="E6ECF4"/>
+          </w:tcPr>
+          <w:p>
+            <w:pPr>
+              <w:spacing w:before="0" w:after="0"/>
+            </w:pPr>
+            <w:r>
+              <w:rPr>
+                <w:b/>
+                <w:sz w:val="20"/>
+              </w:rPr>
+              <w:t>What it means for a measure</w:t>
+            </w:r>
+          </w:p>
+        </w:tc>
+      </w:tr>
+      <w:tr>
+        <w:trPr>
+          <w:cantSplit/>
+        </w:trPr>
+        <w:tc>
+          <w:tcPr>
+            <w:tcW w:type="dxa" w:w="1998"/>
+          </w:tcPr>
+          <w:p>
+            <w:pPr>
+              <w:spacing w:before="0" w:after="0"/>
+            </w:pPr>
+            <w:r>
+              <w:rPr>
+                <w:sz w:val="20"/>
+              </w:rPr>
+              <w:t>Context makes relevance</w:t>
+            </w:r>
+          </w:p>
+        </w:tc>
+        <w:tc>
+          <w:tcPr>
+            <w:tcW w:type="dxa" w:w="3701"/>
+          </w:tcPr>
+          <w:p>
+            <w:pPr>
+              <w:spacing w:before="0" w:after="0"/>
+            </w:pPr>
+            <w:r>
+              <w:rPr>
+                <w:sz w:val="20"/>
+              </w:rPr>
+              <w:t>Transported readers take more of a story's view (Green and Brock 2000).</w:t>
+            </w:r>
+          </w:p>
+        </w:tc>
+        <w:tc>
+          <w:tcPr>
+            <w:tcW w:type="dxa" w:w="3939"/>
+          </w:tcPr>
+          <w:p>
+            <w:pPr>
+              <w:spacing w:before="0" w:after="0"/>
+            </w:pPr>
+            <w:r>
+              <w:rPr>
+                <w:sz w:val="20"/>
+              </w:rPr>
+              <w:t>Explain why a step matters in the person's situation, in one line, before asking for the action.</w:t>
+            </w:r>
+          </w:p>
+        </w:tc>
+      </w:tr>
+      <w:tr>
+        <w:trPr>
+          <w:cantSplit/>
+        </w:trPr>
+        <w:tc>
+          <w:tcPr>
+            <w:tcW w:type="dxa" w:w="1998"/>
+          </w:tcPr>
+          <w:p>
+            <w:pPr>
+              <w:spacing w:before="0" w:after="0"/>
+            </w:pPr>
+            <w:r>
+              <w:rPr>
+                <w:sz w:val="20"/>
+              </w:rPr>
+              <w:t>Progress as context</w:t>
+            </w:r>
+          </w:p>
+        </w:tc>
+        <w:tc>
+          <w:tcPr>
+            <w:tcW w:type="dxa" w:w="3701"/>
+          </w:tcPr>
+          <w:p>
+            <w:pPr>
+              <w:spacing w:before="0" w:after="0"/>
+            </w:pPr>
+            <w:r>
+              <w:rPr>
+                <w:sz w:val="20"/>
+              </w:rPr>
+              <w:t>Perceived distance to the goal drives effort (Kivetz et al. 2006).</w:t>
+            </w:r>
+          </w:p>
+        </w:tc>
+        <w:tc>
+          <w:tcPr>
+            <w:tcW w:type="dxa" w:w="3939"/>
+          </w:tcPr>
+          <w:p>
+            <w:pPr>
+              <w:spacing w:before="0" w:after="0"/>
+            </w:pPr>
+            <w:r>
+              <w:rPr>
+                <w:sz w:val="20"/>
+              </w:rPr>
+              <w:t>A path of stages with “you are here” is a measure with a visible effect.</w:t>
+            </w:r>
+          </w:p>
+        </w:tc>
+      </w:tr>
+      <w:tr>
+        <w:trPr>
+          <w:cantSplit/>
+        </w:trPr>
+        <w:tc>
+          <w:tcPr>
+            <w:tcW w:type="dxa" w:w="1998"/>
+          </w:tcPr>
+          <w:p>
+            <w:pPr>
+              <w:spacing w:before="0" w:after="0"/>
+            </w:pPr>
+            <w:r>
+              <w:rPr>
+                <w:sz w:val="20"/>
+              </w:rPr>
+              <w:t>Credibility</w:t>
+            </w:r>
+          </w:p>
+        </w:tc>
+        <w:tc>
+          <w:tcPr>
+            <w:tcW w:type="dxa" w:w="3701"/>
+          </w:tcPr>
+          <w:p>
+            <w:pPr>
+              <w:spacing w:before="0" w:after="0"/>
+            </w:pPr>
+            <w:r>
+              <w:rPr>
+                <w:sz w:val="20"/>
+              </w:rPr>
+              <w:t>The design look and the tone are read as signs of care (Fogg et al. 2003).</w:t>
+            </w:r>
+          </w:p>
+        </w:tc>
+        <w:tc>
+          <w:tcPr>
+            <w:tcW w:type="dxa" w:w="3939"/>
+          </w:tcPr>
+          <w:p>
+            <w:pPr>
+              <w:spacing w:before="0" w:after="0"/>
+            </w:pPr>
+            <w:r>
+              <w:rPr>
+                <w:sz w:val="20"/>
+              </w:rPr>
+              <w:t>A story that reads as marketing in a serious context costs trust: weigh it.</w:t>
+            </w:r>
+          </w:p>
+        </w:tc>
+      </w:tr>
+    </w:tbl>
+    <w:p>
+      <w:pPr>
+        <w:spacing w:before="0" w:after="80"/>
+      </w:pPr>
+    </w:p>
     <w:tbl>
       <w:tblPr>
         <w:tblW w:w="9598" w:type="dxa"/>
@@ -5651,7 +7163,7 @@
             </w:pPr>
             <w:r>
               <w:rPr/>
-              <w:t>Lantern Kitchens, Iris, Pavel, June and Arne are made up for this example. Designing around users' goals follows Quesenbery and Brooks (2010); rating options on the same criteria with a reason follows Gibbons (2018). The four criteria are the ones the plan names for the case study.</w:t>
+              <w:t>Lantern Kitchens, Iris, Pavel, June and Arne are made up for this example. Designing around users' goals follows Quesenbery and Brooks (2010); rating options on the same criteria with a reason follows Gibbons (2018). The four criteria are the ones the plan names for the case study. The findings in the table of real evidence are real research results, rules and cases; the sources are listed below.</w:t>
             </w:r>
           </w:p>
         </w:tc>
@@ -5840,7 +7352,7 @@
           <w:color w:val="556274"/>
           <w:sz w:val="18"/>
         </w:rPr>
-        <w:t>Quesenbery &amp; Brooks 2010 · Kivetz et al. 2006 · Gibbons 2018</w:t>
+        <w:t>Quesenbery &amp; Brooks 2010 · Kivetz et al. 2006 · Gibbons 2018 · Green &amp; Brock 2000 · Fogg et al. 2003</w:t>
       </w:r>
     </w:p>
     <w:p>
@@ -6147,6 +7659,266 @@
         <w:t>Figure 8 · The layers of narrative UX, from a guiding vision to every step.</w:t>
       </w:r>
     </w:p>
+    <w:p>
+      <w:pPr>
+        <w:spacing w:before="0" w:after="100"/>
+      </w:pPr>
+      <w:r>
+        <w:rPr>
+          <w:b/>
+        </w:rPr>
+        <w:t>Narrative UX as experience architecture: real structures</w:t>
+      </w:r>
+    </w:p>
+    <w:tbl>
+      <w:tblPr>
+        <w:tblW w:w="9638" w:type="dxa"/>
+        <w:tblBorders>
+          <w:top w:val="single" w:sz="4" w:space="0" w:color="D5DEE9"/>
+          <w:left w:val="single" w:sz="4" w:space="0" w:color="D5DEE9"/>
+          <w:bottom w:val="single" w:sz="4" w:space="0" w:color="D5DEE9"/>
+          <w:right w:val="single" w:sz="4" w:space="0" w:color="D5DEE9"/>
+          <w:insideH w:val="single" w:sz="4" w:space="0" w:color="D5DEE9"/>
+          <w:insideV w:val="single" w:sz="4" w:space="0" w:color="D5DEE9"/>
+        </w:tblBorders>
+        <w:tblLayout w:type="fixed"/>
+        <w:tblCellMar>
+          <w:top w:w="60" w:type="dxa"/>
+          <w:left w:w="100" w:type="dxa"/>
+          <w:bottom w:w="60" w:type="dxa"/>
+          <w:right w:w="100" w:type="dxa"/>
+        </w:tblCellMar>
+      </w:tblPr>
+      <w:tblGrid>
+        <w:gridCol w:w="1835"/>
+        <w:gridCol w:w="4573"/>
+        <w:gridCol w:w="3230"/>
+      </w:tblGrid>
+      <w:tr>
+        <w:trPr>
+          <w:cantSplit/>
+          <w:tblHeader/>
+        </w:trPr>
+        <w:tc>
+          <w:tcPr>
+            <w:tcW w:type="dxa" w:w="1835"/>
+            <w:shd w:val="clear" w:color="auto" w:fill="E6ECF4"/>
+          </w:tcPr>
+          <w:p>
+            <w:pPr>
+              <w:spacing w:before="0" w:after="0"/>
+            </w:pPr>
+            <w:r>
+              <w:rPr>
+                <w:b/>
+                <w:sz w:val="20"/>
+              </w:rPr>
+              <w:t>Part</w:t>
+            </w:r>
+          </w:p>
+        </w:tc>
+        <w:tc>
+          <w:tcPr>
+            <w:tcW w:type="dxa" w:w="4573"/>
+            <w:shd w:val="clear" w:color="auto" w:fill="E6ECF4"/>
+          </w:tcPr>
+          <w:p>
+            <w:pPr>
+              <w:spacing w:before="0" w:after="0"/>
+            </w:pPr>
+            <w:r>
+              <w:rPr>
+                <w:b/>
+                <w:sz w:val="20"/>
+              </w:rPr>
+              <w:t>Real example</w:t>
+            </w:r>
+          </w:p>
+        </w:tc>
+        <w:tc>
+          <w:tcPr>
+            <w:tcW w:type="dxa" w:w="3230"/>
+            <w:shd w:val="clear" w:color="auto" w:fill="E6ECF4"/>
+          </w:tcPr>
+          <w:p>
+            <w:pPr>
+              <w:spacing w:before="0" w:after="0"/>
+            </w:pPr>
+            <w:r>
+              <w:rPr>
+                <w:b/>
+                <w:sz w:val="20"/>
+              </w:rPr>
+              <w:t>What it means</w:t>
+            </w:r>
+          </w:p>
+        </w:tc>
+      </w:tr>
+      <w:tr>
+        <w:trPr>
+          <w:cantSplit/>
+        </w:trPr>
+        <w:tc>
+          <w:tcPr>
+            <w:tcW w:type="dxa" w:w="1835"/>
+          </w:tcPr>
+          <w:p>
+            <w:pPr>
+              <w:spacing w:before="0" w:after="0"/>
+            </w:pPr>
+            <w:r>
+              <w:rPr>
+                <w:sz w:val="20"/>
+              </w:rPr>
+              <w:t>A journey of single steps</w:t>
+            </w:r>
+          </w:p>
+        </w:tc>
+        <w:tc>
+          <w:tcPr>
+            <w:tcW w:type="dxa" w:w="4573"/>
+          </w:tcPr>
+          <w:p>
+            <w:pPr>
+              <w:spacing w:before="0" w:after="0"/>
+            </w:pPr>
+            <w:r>
+              <w:rPr>
+                <w:sz w:val="20"/>
+              </w:rPr>
+              <w:t>The GOV.UK pattern of one thing per page turns a whole service into a sequence of small decisions (GOV.UK Service Manual).</w:t>
+            </w:r>
+          </w:p>
+        </w:tc>
+        <w:tc>
+          <w:tcPr>
+            <w:tcW w:type="dxa" w:w="3230"/>
+          </w:tcPr>
+          <w:p>
+            <w:pPr>
+              <w:spacing w:before="0" w:after="0"/>
+            </w:pPr>
+            <w:r>
+              <w:rPr>
+                <w:sz w:val="20"/>
+              </w:rPr>
+              <w:t>Plan the journey as a sequence across channels, not as a campaign.</w:t>
+            </w:r>
+          </w:p>
+        </w:tc>
+      </w:tr>
+      <w:tr>
+        <w:trPr>
+          <w:cantSplit/>
+        </w:trPr>
+        <w:tc>
+          <w:tcPr>
+            <w:tcW w:type="dxa" w:w="1835"/>
+          </w:tcPr>
+          <w:p>
+            <w:pPr>
+              <w:spacing w:before="0" w:after="0"/>
+            </w:pPr>
+            <w:r>
+              <w:rPr>
+                <w:sz w:val="20"/>
+              </w:rPr>
+              <w:t>A tone by situation</w:t>
+            </w:r>
+          </w:p>
+        </w:tc>
+        <w:tc>
+          <w:tcPr>
+            <w:tcW w:type="dxa" w:w="4573"/>
+          </w:tcPr>
+          <w:p>
+            <w:pPr>
+              <w:spacing w:before="0" w:after="0"/>
+            </w:pPr>
+            <w:r>
+              <w:rPr>
+                <w:sz w:val="20"/>
+              </w:rPr>
+              <w:t>A steady voice with a tone that follows the situation of the reader (Mailchimp, Voice and Tone).</w:t>
+            </w:r>
+          </w:p>
+        </w:tc>
+        <w:tc>
+          <w:tcPr>
+            <w:tcW w:type="dxa" w:w="3230"/>
+          </w:tcPr>
+          <w:p>
+            <w:pPr>
+              <w:spacing w:before="0" w:after="0"/>
+            </w:pPr>
+            <w:r>
+              <w:rPr>
+                <w:sz w:val="20"/>
+              </w:rPr>
+              <w:t>Decide how the story sounds at each point of the journey.</w:t>
+            </w:r>
+          </w:p>
+        </w:tc>
+      </w:tr>
+      <w:tr>
+        <w:trPr>
+          <w:cantSplit/>
+        </w:trPr>
+        <w:tc>
+          <w:tcPr>
+            <w:tcW w:type="dxa" w:w="1835"/>
+          </w:tcPr>
+          <w:p>
+            <w:pPr>
+              <w:spacing w:before="0" w:after="0"/>
+            </w:pPr>
+            <w:r>
+              <w:rPr>
+                <w:sz w:val="20"/>
+              </w:rPr>
+              <w:t>A dramatic structure</w:t>
+            </w:r>
+          </w:p>
+        </w:tc>
+        <w:tc>
+          <w:tcPr>
+            <w:tcW w:type="dxa" w:w="4573"/>
+          </w:tcPr>
+          <w:p>
+            <w:pPr>
+              <w:spacing w:before="0" w:after="0"/>
+            </w:pPr>
+            <w:r>
+              <w:rPr>
+                <w:sz w:val="20"/>
+              </w:rPr>
+              <w:t>Freytag's five parts give the arc of a journey: situation, build-up, decision, resolution (Freytag 1863).</w:t>
+            </w:r>
+          </w:p>
+        </w:tc>
+        <w:tc>
+          <w:tcPr>
+            <w:tcW w:type="dxa" w:w="3230"/>
+          </w:tcPr>
+          <w:p>
+            <w:pPr>
+              <w:spacing w:before="0" w:after="0"/>
+            </w:pPr>
+            <w:r>
+              <w:rPr>
+                <w:sz w:val="20"/>
+              </w:rPr>
+              <w:t>Name the moment of decision and the moment of resolution of each journey.</w:t>
+            </w:r>
+          </w:p>
+        </w:tc>
+      </w:tr>
+    </w:tbl>
+    <w:p>
+      <w:pPr>
+        <w:spacing w:before="0" w:after="80"/>
+      </w:pPr>
+    </w:p>
     <w:tbl>
       <w:tblPr>
         <w:tblW w:w="9598" w:type="dxa"/>
@@ -6196,7 +7968,7 @@
             </w:pPr>
             <w:r>
               <w:rPr/>
-              <w:t>Lantern Kitchens, Iris, Pavel, June and Arne are made up for this example. Storytelling as part of UX design follows Quesenbery and Brooks (2010) and Lupton (2017).</w:t>
+              <w:t>Lantern Kitchens, Iris, Pavel, June and Arne are made up for this example. Storytelling as part of UX design follows Quesenbery and Brooks (2010) and Lupton (2017). The findings in the table of real evidence are real research results, rules and cases; the sources are listed below.</w:t>
             </w:r>
           </w:p>
         </w:tc>
@@ -6385,7 +8157,7 @@
           <w:color w:val="556274"/>
           <w:sz w:val="18"/>
         </w:rPr>
-        <w:t>Quesenbery &amp; Brooks 2010 · Lupton 2017 · Bruner 1991</w:t>
+        <w:t>Quesenbery &amp; Brooks 2010 · Lupton 2017 · Bruner 1991 · GOV.UK Service Manual, Form structure · Mailchimp, Voice and Tone · Freytag 1863</w:t>
       </w:r>
     </w:p>
     <w:p>
@@ -6825,6 +8597,266 @@
         <w:spacing w:before="0" w:after="80"/>
       </w:pPr>
     </w:p>
+    <w:p>
+      <w:pPr>
+        <w:spacing w:before="0" w:after="100"/>
+      </w:pPr>
+      <w:r>
+        <w:rPr>
+          <w:b/>
+        </w:rPr>
+        <w:t>Conflicts of narrative UX, with evidence</w:t>
+      </w:r>
+    </w:p>
+    <w:tbl>
+      <w:tblPr>
+        <w:tblW w:w="9638" w:type="dxa"/>
+        <w:tblBorders>
+          <w:top w:val="single" w:sz="4" w:space="0" w:color="D5DEE9"/>
+          <w:left w:val="single" w:sz="4" w:space="0" w:color="D5DEE9"/>
+          <w:bottom w:val="single" w:sz="4" w:space="0" w:color="D5DEE9"/>
+          <w:right w:val="single" w:sz="4" w:space="0" w:color="D5DEE9"/>
+          <w:insideH w:val="single" w:sz="4" w:space="0" w:color="D5DEE9"/>
+          <w:insideV w:val="single" w:sz="4" w:space="0" w:color="D5DEE9"/>
+        </w:tblBorders>
+        <w:tblLayout w:type="fixed"/>
+        <w:tblCellMar>
+          <w:top w:w="60" w:type="dxa"/>
+          <w:left w:w="100" w:type="dxa"/>
+          <w:bottom w:w="60" w:type="dxa"/>
+          <w:right w:w="100" w:type="dxa"/>
+        </w:tblCellMar>
+      </w:tblPr>
+      <w:tblGrid>
+        <w:gridCol w:w="2527"/>
+        <w:gridCol w:w="4392"/>
+        <w:gridCol w:w="2719"/>
+      </w:tblGrid>
+      <w:tr>
+        <w:trPr>
+          <w:cantSplit/>
+          <w:tblHeader/>
+        </w:trPr>
+        <w:tc>
+          <w:tcPr>
+            <w:tcW w:type="dxa" w:w="2527"/>
+            <w:shd w:val="clear" w:color="auto" w:fill="E6ECF4"/>
+          </w:tcPr>
+          <w:p>
+            <w:pPr>
+              <w:spacing w:before="0" w:after="0"/>
+            </w:pPr>
+            <w:r>
+              <w:rPr>
+                <w:b/>
+                <w:sz w:val="20"/>
+              </w:rPr>
+              <w:t>Conflict</w:t>
+            </w:r>
+          </w:p>
+        </w:tc>
+        <w:tc>
+          <w:tcPr>
+            <w:tcW w:type="dxa" w:w="4392"/>
+            <w:shd w:val="clear" w:color="auto" w:fill="E6ECF4"/>
+          </w:tcPr>
+          <w:p>
+            <w:pPr>
+              <w:spacing w:before="0" w:after="0"/>
+            </w:pPr>
+            <w:r>
+              <w:rPr>
+                <w:b/>
+                <w:sz w:val="20"/>
+              </w:rPr>
+              <w:t>What the evidence says</w:t>
+            </w:r>
+          </w:p>
+        </w:tc>
+        <w:tc>
+          <w:tcPr>
+            <w:tcW w:type="dxa" w:w="2719"/>
+            <w:shd w:val="clear" w:color="auto" w:fill="E6ECF4"/>
+          </w:tcPr>
+          <w:p>
+            <w:pPr>
+              <w:spacing w:before="0" w:after="0"/>
+            </w:pPr>
+            <w:r>
+              <w:rPr>
+                <w:b/>
+                <w:sz w:val="20"/>
+              </w:rPr>
+              <w:t>A way to decide</w:t>
+            </w:r>
+          </w:p>
+        </w:tc>
+      </w:tr>
+      <w:tr>
+        <w:trPr>
+          <w:cantSplit/>
+        </w:trPr>
+        <w:tc>
+          <w:tcPr>
+            <w:tcW w:type="dxa" w:w="2527"/>
+          </w:tcPr>
+          <w:p>
+            <w:pPr>
+              <w:spacing w:before="0" w:after="0"/>
+            </w:pPr>
+            <w:r>
+              <w:rPr>
+                <w:sz w:val="20"/>
+              </w:rPr>
+              <w:t>Efficiency against dramaturgy</w:t>
+            </w:r>
+          </w:p>
+        </w:tc>
+        <w:tc>
+          <w:tcPr>
+            <w:tcW w:type="dxa" w:w="4392"/>
+          </w:tcPr>
+          <w:p>
+            <w:pPr>
+              <w:spacing w:before="0" w:after="0"/>
+            </w:pPr>
+            <w:r>
+              <w:rPr>
+                <w:sz w:val="20"/>
+              </w:rPr>
+              <w:t>79% of users always scanned a new page (Nielsen and Morkes 1997), and a one-question-per-page form is longer (GOV.UK Design System).</w:t>
+            </w:r>
+          </w:p>
+        </w:tc>
+        <w:tc>
+          <w:tcPr>
+            <w:tcW w:type="dxa" w:w="2719"/>
+          </w:tcPr>
+          <w:p>
+            <w:pPr>
+              <w:spacing w:before="0" w:after="0"/>
+            </w:pPr>
+            <w:r>
+              <w:rPr>
+                <w:sz w:val="20"/>
+              </w:rPr>
+              <w:t>Ask how long and how important the journey is for the person, and tell the story only where it helps the task.</w:t>
+            </w:r>
+          </w:p>
+        </w:tc>
+      </w:tr>
+      <w:tr>
+        <w:trPr>
+          <w:cantSplit/>
+        </w:trPr>
+        <w:tc>
+          <w:tcPr>
+            <w:tcW w:type="dxa" w:w="2527"/>
+          </w:tcPr>
+          <w:p>
+            <w:pPr>
+              <w:spacing w:before="0" w:after="0"/>
+            </w:pPr>
+            <w:r>
+              <w:rPr>
+                <w:sz w:val="20"/>
+              </w:rPr>
+              <w:t>Emotionalisation against seriousness</w:t>
+            </w:r>
+          </w:p>
+        </w:tc>
+        <w:tc>
+          <w:tcPr>
+            <w:tcW w:type="dxa" w:w="4392"/>
+          </w:tcPr>
+          <w:p>
+            <w:pPr>
+              <w:spacing w:before="0" w:after="0"/>
+            </w:pPr>
+            <w:r>
+              <w:rPr>
+                <w:sz w:val="20"/>
+              </w:rPr>
+              <w:t>Pressure and false urgency were found on about 11% of the crawled shopping websites (Mathur et al. 2019).</w:t>
+            </w:r>
+          </w:p>
+        </w:tc>
+        <w:tc>
+          <w:tcPr>
+            <w:tcW w:type="dxa" w:w="2719"/>
+          </w:tcPr>
+          <w:p>
+            <w:pPr>
+              <w:spacing w:before="0" w:after="0"/>
+            </w:pPr>
+            <w:r>
+              <w:rPr>
+                <w:sz w:val="20"/>
+              </w:rPr>
+              <w:t>Keep the emotion true to the situation; test whether the message would work if people knew why it was written.</w:t>
+            </w:r>
+          </w:p>
+        </w:tc>
+      </w:tr>
+      <w:tr>
+        <w:trPr>
+          <w:cantSplit/>
+        </w:trPr>
+        <w:tc>
+          <w:tcPr>
+            <w:tcW w:type="dxa" w:w="2527"/>
+          </w:tcPr>
+          <w:p>
+            <w:pPr>
+              <w:spacing w:before="0" w:after="0"/>
+            </w:pPr>
+            <w:r>
+              <w:rPr>
+                <w:sz w:val="20"/>
+              </w:rPr>
+              <w:t>Brand effect against the user's task</w:t>
+            </w:r>
+          </w:p>
+        </w:tc>
+        <w:tc>
+          <w:tcPr>
+            <w:tcW w:type="dxa" w:w="4392"/>
+          </w:tcPr>
+          <w:p>
+            <w:pPr>
+              <w:spacing w:before="0" w:after="0"/>
+            </w:pPr>
+            <w:r>
+              <w:rPr>
+                <w:sz w:val="20"/>
+              </w:rPr>
+              <w:t>GOV.UK started from user needs, not from the existing way of working (Government Digital Service 2012).</w:t>
+            </w:r>
+          </w:p>
+        </w:tc>
+        <w:tc>
+          <w:tcPr>
+            <w:tcW w:type="dxa" w:w="2719"/>
+          </w:tcPr>
+          <w:p>
+            <w:pPr>
+              <w:spacing w:before="0" w:after="0"/>
+            </w:pPr>
+            <w:r>
+              <w:rPr>
+                <w:sz w:val="20"/>
+              </w:rPr>
+              <w:t>Ask whose story each step tells.</w:t>
+            </w:r>
+          </w:p>
+        </w:tc>
+      </w:tr>
+    </w:tbl>
+    <w:p>
+      <w:pPr>
+        <w:spacing w:before="0" w:after="80"/>
+      </w:pPr>
+    </w:p>
     <w:tbl>
       <w:tblPr>
         <w:tblW w:w="9598" w:type="dxa"/>
@@ -6874,7 +8906,7 @@
             </w:pPr>
             <w:r>
               <w:rPr/>
-              <w:t>Lantern Kitchens, Iris, Pavel, June and Arne are made up for this example. The three journeys are a reading of the example, not a rule for every product.</w:t>
+              <w:t>Lantern Kitchens, Iris, Pavel, June and Arne are made up for this example. The three journeys are a reading of the example, not a rule for every product. The findings in the table of real evidence are real research results, rules and cases; the sources are listed below.</w:t>
             </w:r>
           </w:p>
         </w:tc>
@@ -7063,7 +9095,7 @@
           <w:color w:val="556274"/>
           <w:sz w:val="18"/>
         </w:rPr>
-        <w:t>Green &amp; Brock 2000 · Krug 2014 · Gibbons 2018</w:t>
+        <w:t>Green &amp; Brock 2000 · Krug 2014 · Gibbons 2018 · Nielsen 1997 · GOV.UK Design System, Question pages · Mathur et al. 2019 · Government Digital Service 2012</w:t>
       </w:r>
     </w:p>
     <w:p>
@@ -7503,6 +9535,266 @@
         <w:spacing w:before="0" w:after="80"/>
       </w:pPr>
     </w:p>
+    <w:p>
+      <w:pPr>
+        <w:spacing w:before="0" w:after="100"/>
+      </w:pPr>
+      <w:r>
+        <w:rPr>
+          <w:b/>
+        </w:rPr>
+        <w:t>Owning narrative UX: real rules and cases</w:t>
+      </w:r>
+    </w:p>
+    <w:tbl>
+      <w:tblPr>
+        <w:tblW w:w="9638" w:type="dxa"/>
+        <w:tblBorders>
+          <w:top w:val="single" w:sz="4" w:space="0" w:color="D5DEE9"/>
+          <w:left w:val="single" w:sz="4" w:space="0" w:color="D5DEE9"/>
+          <w:bottom w:val="single" w:sz="4" w:space="0" w:color="D5DEE9"/>
+          <w:right w:val="single" w:sz="4" w:space="0" w:color="D5DEE9"/>
+          <w:insideH w:val="single" w:sz="4" w:space="0" w:color="D5DEE9"/>
+          <w:insideV w:val="single" w:sz="4" w:space="0" w:color="D5DEE9"/>
+        </w:tblBorders>
+        <w:tblLayout w:type="fixed"/>
+        <w:tblCellMar>
+          <w:top w:w="60" w:type="dxa"/>
+          <w:left w:w="100" w:type="dxa"/>
+          <w:bottom w:w="60" w:type="dxa"/>
+          <w:right w:w="100" w:type="dxa"/>
+        </w:tblCellMar>
+      </w:tblPr>
+      <w:tblGrid>
+        <w:gridCol w:w="1448"/>
+        <w:gridCol w:w="4742"/>
+        <w:gridCol w:w="3448"/>
+      </w:tblGrid>
+      <w:tr>
+        <w:trPr>
+          <w:cantSplit/>
+          <w:tblHeader/>
+        </w:trPr>
+        <w:tc>
+          <w:tcPr>
+            <w:tcW w:type="dxa" w:w="1448"/>
+            <w:shd w:val="clear" w:color="auto" w:fill="E6ECF4"/>
+          </w:tcPr>
+          <w:p>
+            <w:pPr>
+              <w:spacing w:before="0" w:after="0"/>
+            </w:pPr>
+            <w:r>
+              <w:rPr>
+                <w:b/>
+                <w:sz w:val="20"/>
+              </w:rPr>
+              <w:t>Part</w:t>
+            </w:r>
+          </w:p>
+        </w:tc>
+        <w:tc>
+          <w:tcPr>
+            <w:tcW w:type="dxa" w:w="4742"/>
+            <w:shd w:val="clear" w:color="auto" w:fill="E6ECF4"/>
+          </w:tcPr>
+          <w:p>
+            <w:pPr>
+              <w:spacing w:before="0" w:after="0"/>
+            </w:pPr>
+            <w:r>
+              <w:rPr>
+                <w:b/>
+                <w:sz w:val="20"/>
+              </w:rPr>
+              <w:t>Real example or rule</w:t>
+            </w:r>
+          </w:p>
+        </w:tc>
+        <w:tc>
+          <w:tcPr>
+            <w:tcW w:type="dxa" w:w="3448"/>
+            <w:shd w:val="clear" w:color="auto" w:fill="E6ECF4"/>
+          </w:tcPr>
+          <w:p>
+            <w:pPr>
+              <w:spacing w:before="0" w:after="0"/>
+            </w:pPr>
+            <w:r>
+              <w:rPr>
+                <w:b/>
+                <w:sz w:val="20"/>
+              </w:rPr>
+              <w:t>What it means</w:t>
+            </w:r>
+          </w:p>
+        </w:tc>
+      </w:tr>
+      <w:tr>
+        <w:trPr>
+          <w:cantSplit/>
+        </w:trPr>
+        <w:tc>
+          <w:tcPr>
+            <w:tcW w:type="dxa" w:w="1448"/>
+          </w:tcPr>
+          <w:p>
+            <w:pPr>
+              <w:spacing w:before="0" w:after="0"/>
+            </w:pPr>
+            <w:r>
+              <w:rPr>
+                <w:sz w:val="20"/>
+              </w:rPr>
+              <w:t>Who owns the pattern</w:t>
+            </w:r>
+          </w:p>
+        </w:tc>
+        <w:tc>
+          <w:tcPr>
+            <w:tcW w:type="dxa" w:w="4742"/>
+          </w:tcPr>
+          <w:p>
+            <w:pPr>
+              <w:spacing w:before="0" w:after="0"/>
+            </w:pPr>
+            <w:r>
+              <w:rPr>
+                <w:sz w:val="20"/>
+              </w:rPr>
+              <w:t>The GOV.UK Design System keeps its question pages pattern as a shared, reviewed standard (GOV.UK Design System).</w:t>
+            </w:r>
+          </w:p>
+        </w:tc>
+        <w:tc>
+          <w:tcPr>
+            <w:tcW w:type="dxa" w:w="3448"/>
+          </w:tcPr>
+          <w:p>
+            <w:pPr>
+              <w:spacing w:before="0" w:after="0"/>
+            </w:pPr>
+            <w:r>
+              <w:rPr>
+                <w:sz w:val="20"/>
+              </w:rPr>
+              <w:t>Name an owner for the patterns and let teams use them.</w:t>
+            </w:r>
+          </w:p>
+        </w:tc>
+      </w:tr>
+      <w:tr>
+        <w:trPr>
+          <w:cantSplit/>
+        </w:trPr>
+        <w:tc>
+          <w:tcPr>
+            <w:tcW w:type="dxa" w:w="1448"/>
+          </w:tcPr>
+          <w:p>
+            <w:pPr>
+              <w:spacing w:before="0" w:after="0"/>
+            </w:pPr>
+            <w:r>
+              <w:rPr>
+                <w:sz w:val="20"/>
+              </w:rPr>
+              <w:t>Who checks</w:t>
+            </w:r>
+          </w:p>
+        </w:tc>
+        <w:tc>
+          <w:tcPr>
+            <w:tcW w:type="dxa" w:w="4742"/>
+          </w:tcPr>
+          <w:p>
+            <w:pPr>
+              <w:spacing w:before="0" w:after="0"/>
+            </w:pPr>
+            <w:r>
+              <w:rPr>
+                <w:sz w:val="20"/>
+              </w:rPr>
+              <w:t>Article 25 of the EU Digital Services Act forbids manipulative interface design on online platforms.</w:t>
+            </w:r>
+          </w:p>
+        </w:tc>
+        <w:tc>
+          <w:tcPr>
+            <w:tcW w:type="dxa" w:w="3448"/>
+          </w:tcPr>
+          <w:p>
+            <w:pPr>
+              <w:spacing w:before="0" w:after="0"/>
+            </w:pPr>
+            <w:r>
+              <w:rPr>
+                <w:sz w:val="20"/>
+              </w:rPr>
+              <w:t>Have the specialist and the legal view check every line that carries emotion.</w:t>
+            </w:r>
+          </w:p>
+        </w:tc>
+      </w:tr>
+      <w:tr>
+        <w:trPr>
+          <w:cantSplit/>
+        </w:trPr>
+        <w:tc>
+          <w:tcPr>
+            <w:tcW w:type="dxa" w:w="1448"/>
+          </w:tcPr>
+          <w:p>
+            <w:pPr>
+              <w:spacing w:before="0" w:after="0"/>
+            </w:pPr>
+            <w:r>
+              <w:rPr>
+                <w:sz w:val="20"/>
+              </w:rPr>
+              <w:t>A shared guide</w:t>
+            </w:r>
+          </w:p>
+        </w:tc>
+        <w:tc>
+          <w:tcPr>
+            <w:tcW w:type="dxa" w:w="4742"/>
+          </w:tcPr>
+          <w:p>
+            <w:pPr>
+              <w:spacing w:before="0" w:after="0"/>
+            </w:pPr>
+            <w:r>
+              <w:rPr>
+                <w:sz w:val="20"/>
+              </w:rPr>
+              <w:t>Mailchimp's voice and tone guide is a public document its writers share (Mailchimp, Voice and Tone).</w:t>
+            </w:r>
+          </w:p>
+        </w:tc>
+        <w:tc>
+          <w:tcPr>
+            <w:tcW w:type="dxa" w:w="3448"/>
+          </w:tcPr>
+          <w:p>
+            <w:pPr>
+              <w:spacing w:before="0" w:after="0"/>
+            </w:pPr>
+            <w:r>
+              <w:rPr>
+                <w:sz w:val="20"/>
+              </w:rPr>
+              <w:t>Publish the story and tone rules, so a conflict can be decided against them.</w:t>
+            </w:r>
+          </w:p>
+        </w:tc>
+      </w:tr>
+    </w:tbl>
+    <w:p>
+      <w:pPr>
+        <w:spacing w:before="0" w:after="80"/>
+      </w:pPr>
+    </w:p>
     <w:tbl>
       <w:tblPr>
         <w:tblW w:w="9598" w:type="dxa"/>
@@ -7552,7 +9844,7 @@
             </w:pPr>
             <w:r>
               <w:rPr/>
-              <w:t>Lantern Kitchens, Iris, Pavel, June and Arne are made up for this example. Deciding with limited information follows Simon (1956); the premortem follows Klein (2007).</w:t>
+              <w:t>Lantern Kitchens, Iris, Pavel, June and Arne are made up for this example. Deciding with limited information follows Simon (1956); the premortem follows Klein (2007). The findings in the table of real evidence are real research results, rules and cases; the sources are listed below.</w:t>
             </w:r>
           </w:p>
         </w:tc>
@@ -7741,7 +10033,7 @@
           <w:color w:val="556274"/>
           <w:sz w:val="18"/>
         </w:rPr>
-        <w:t>Simon 1956 · Klein 2007 · Quesenbery &amp; Brooks 2010</w:t>
+        <w:t>Simon 1956 · Klein 2007 · Quesenbery &amp; Brooks 2010 · GOV.UK Design System, Question pages · EU Digital Services Act · Mailchimp, Voice and Tone</w:t>
       </w:r>
     </w:p>
     <w:p>
@@ -8426,7 +10718,7 @@
         <w:rPr>
           <w:sz w:val="19"/>
         </w:rPr>
-        <w:t>Freytag, G. (1863). Die Technik des Dramas. Hirzel. (The classic arc of exposition, rising action, climax, falling action and resolution.)</w:t>
+        <w:t>Green, M. C., &amp; Brock, T. C. (2000). The role of transportation in the persuasiveness of public narratives. Journal of Personality and Social Psychology, 79(5), 701–721. (People absorbed in a story are moved by it; the effect depends on the story fitting them.)</w:t>
       </w:r>
     </w:p>
     <w:p>
@@ -8450,6 +10742,42 @@
         <w:rPr>
           <w:sz w:val="19"/>
         </w:rPr>
+        <w:t>Nunes, J. C., &amp; Drèze, X. (2006). The endowed progress effect: How artificial advancement increases effort. Journal of Consumer Research, 32(4), 504–512. (Customers of a car wash got a card with a head start of two stamps or a card without one; the head start group was compared on completion. Check the paper for the figures.)</w:t>
+      </w:r>
+    </w:p>
+    <w:p>
+      <w:pPr>
+        <w:spacing w:before="0" w:after="80"/>
+        <w:ind w:left="283" w:hanging="283"/>
+      </w:pPr>
+      <w:r>
+        <w:rPr>
+          <w:sz w:val="19"/>
+        </w:rPr>
+        <w:t>Freytag, G. (1863). Die Technik des Dramas. Hirzel. (The classic arc of exposition, rising action, climax, falling action and resolution.)</w:t>
+      </w:r>
+    </w:p>
+    <w:p>
+      <w:pPr>
+        <w:spacing w:before="0" w:after="80"/>
+        <w:ind w:left="283" w:hanging="283"/>
+      </w:pPr>
+      <w:r>
+        <w:rPr>
+          <w:sz w:val="19"/>
+        </w:rPr>
+        <w:t>GOV.UK Design System. Question pages. https://design-system.service.gov.uk/patterns/question-pages (Start by asking one question per page, so users understand what they are asked and can focus on it; the pattern lengthens a form, so ask only for what is needed.)</w:t>
+      </w:r>
+    </w:p>
+    <w:p>
+      <w:pPr>
+        <w:spacing w:before="0" w:after="80"/>
+        <w:ind w:left="283" w:hanging="283"/>
+      </w:pPr>
+      <w:r>
+        <w:rPr>
+          <w:sz w:val="19"/>
+        </w:rPr>
         <w:t>Nielsen, J. (1994, reviewed 2024). 10 Usability Heuristics for User Interface Design. Nielsen Norman Group. https://www.nngroup.com/articles/ten-usability-heuristics/ (Visibility of system status, consistency and standards, recognition rather than recall, aesthetic and minimalist design.)</w:t>
       </w:r>
     </w:p>
@@ -8462,7 +10790,19 @@
         <w:rPr>
           <w:sz w:val="19"/>
         </w:rPr>
-        <w:t>Green, M. C., &amp; Brock, T. C. (2000). The role of transportation in the persuasiveness of public narratives. Journal of Personality and Social Psychology, 79(5), 701–721. (People absorbed in a story are moved by it; the effect depends on the story fitting them.)</w:t>
+        <w:t>GOV.UK Service Manual. Form structure. https://www.gov.uk/service-manual/design/form-structure (Start by splitting the form across multiple pages, each page containing just one thing.)</w:t>
+      </w:r>
+    </w:p>
+    <w:p>
+      <w:pPr>
+        <w:spacing w:before="0" w:after="80"/>
+        <w:ind w:left="283" w:hanging="283"/>
+      </w:pPr>
+      <w:r>
+        <w:rPr>
+          <w:sz w:val="19"/>
+        </w:rPr>
+        <w:t>Government Digital Service (2015). One thing per page. GDS Design Notes, 3 July 2015. https://designnotes.blog.gov.uk/2015/07/03/one-thing-per-page/ (The one-question layout was better at handling errors, branches, loops and saving progress than the alternatives compared.)</w:t>
       </w:r>
     </w:p>
     <w:p>
@@ -8486,7 +10826,79 @@
         <w:rPr>
           <w:sz w:val="19"/>
         </w:rPr>
+        <w:t>Kahneman, D., Fredrickson, B. L., Schreiber, C. A., &amp; Redelmeier, D. A. (1993). When more pain is preferred to less: Adding a better end. Psychological Science, 4(6), 401–405. (People remember an experience mostly by its strongest moment and its end: the peak-end rule.)</w:t>
+      </w:r>
+    </w:p>
+    <w:p>
+      <w:pPr>
+        <w:spacing w:before="0" w:after="80"/>
+        <w:ind w:left="283" w:hanging="283"/>
+      </w:pPr>
+      <w:r>
+        <w:rPr>
+          <w:sz w:val="19"/>
+        </w:rPr>
+        <w:t>Nielsen, J. (1997). How Users Read on the Web. Nielsen Norman Group. https://www.nngroup.com/articles/how-users-read-on-the-web/ (Most users scan a page rather than read it word by word, picking out words, headings and links.)</w:t>
+      </w:r>
+    </w:p>
+    <w:p>
+      <w:pPr>
+        <w:spacing w:before="0" w:after="80"/>
+        <w:ind w:left="283" w:hanging="283"/>
+      </w:pPr>
+      <w:r>
+        <w:rPr>
+          <w:sz w:val="19"/>
+        </w:rPr>
         <w:t>Gibbons, S. (2018). Using Prioritization Matrices to Inform UX Decisions. Nielsen Norman Group. https://www.nngroup.com/articles/prioritization-matrices/ (Rate each option on the same few criteria, such as value to the user against effort, and put the reason next to each rating.)</w:t>
+      </w:r>
+    </w:p>
+    <w:p>
+      <w:pPr>
+        <w:spacing w:before="0" w:after="80"/>
+        <w:ind w:left="283" w:hanging="283"/>
+      </w:pPr>
+      <w:r>
+        <w:rPr>
+          <w:sz w:val="19"/>
+        </w:rPr>
+        <w:t>Fogg, B. J., Soohoo, C., Danielson, D. R., Marable, L., Stanford, J., &amp; Tauber, E. R. (2003). How do users evaluate the credibility of Web sites? A study with over 2,500 participants. Proceedings of DUX '03. (2,684 people judged the credibility of 100 live sites; the design look was the factor mentioned most often, in 46.1% of their comments.)</w:t>
+      </w:r>
+    </w:p>
+    <w:p>
+      <w:pPr>
+        <w:spacing w:before="0" w:after="80"/>
+        <w:ind w:left="283" w:hanging="283"/>
+      </w:pPr>
+      <w:r>
+        <w:rPr>
+          <w:sz w:val="19"/>
+        </w:rPr>
+        <w:t>Mailchimp. Content Style Guide: Voice and Tone. https://styleguide.mailchimp.com/voice-and-tone/ (The voice stays steady and the tone changes with the situation and the feeling of the reader; the guide is published under a Creative Commons licence.)</w:t>
+      </w:r>
+    </w:p>
+    <w:p>
+      <w:pPr>
+        <w:spacing w:before="0" w:after="80"/>
+        <w:ind w:left="283" w:hanging="283"/>
+      </w:pPr>
+      <w:r>
+        <w:rPr>
+          <w:sz w:val="19"/>
+        </w:rPr>
+        <w:t>Mathur, A., Acar, G., Friedman, M. J., Lucherini, E., Mayer, J., Chetty, M., &amp; Narayanan, A. (2019). Dark patterns at scale: Findings from a crawl of 11K shopping websites. Proceedings of the ACM on Human-Computer Interaction, 3(CSCW), 1–32. (False urgency, scarcity and confirmshaming are widespread ways of using emotion against users.)</w:t>
+      </w:r>
+    </w:p>
+    <w:p>
+      <w:pPr>
+        <w:spacing w:before="0" w:after="80"/>
+        <w:ind w:left="283" w:hanging="283"/>
+      </w:pPr>
+      <w:r>
+        <w:rPr>
+          <w:sz w:val="19"/>
+        </w:rPr>
+        <w:t>Government Digital Service (2012). Why GOV.UK matters, and the GOV.UK design principles. Government Digital Service blog. https://gds.blog.gov.uk/2012/10/17/why-gov-uk-matters (GOV.UK replaced Directgov and Business Link on 17 October 2012, starting from user needs; the design principles begin with “Start with user needs”. Reported figures such as 61% against 46% task success are the service's own.)</w:t>
       </w:r>
     </w:p>
     <w:p>
@@ -8511,6 +10923,18 @@
           <w:sz w:val="19"/>
         </w:rPr>
         <w:t>Klein, G. (2007). Performing a project premortem. Harvard Business Review, 85(9), 18–19. (Imagine the plan has failed and ask why; it brings risks and wrong assumptions to the surface before the work starts.)</w:t>
+      </w:r>
+    </w:p>
+    <w:p>
+      <w:pPr>
+        <w:spacing w:before="0" w:after="80"/>
+        <w:ind w:left="283" w:hanging="283"/>
+      </w:pPr>
+      <w:r>
+        <w:rPr>
+          <w:sz w:val="19"/>
+        </w:rPr>
+        <w:t>Regulation (EU) 2022/2065 of the European Parliament and of the Council (Digital Services Act), Article 25. https://eur-lex.europa.eu/eli/reg/2022/2065/oj (Online platforms must not design their interfaces in a way that deceives or manipulates users or impairs their ability to make free and informed decisions.)</w:t>
       </w:r>
     </w:p>
     <w:p>
@@ -8559,10 +10983,10 @@
         </w:tblCellMar>
       </w:tblPr>
       <w:tblGrid>
-        <w:gridCol w:w="2013"/>
-        <w:gridCol w:w="5230"/>
-        <w:gridCol w:w="1484"/>
-        <w:gridCol w:w="911"/>
+        <w:gridCol w:w="2011"/>
+        <w:gridCol w:w="5249"/>
+        <w:gridCol w:w="1465"/>
+        <w:gridCol w:w="913"/>
       </w:tblGrid>
       <w:tr>
         <w:trPr>
@@ -8571,7 +10995,7 @@
         </w:trPr>
         <w:tc>
           <w:tcPr>
-            <w:tcW w:type="dxa" w:w="2013"/>
+            <w:tcW w:type="dxa" w:w="2011"/>
             <w:shd w:val="clear" w:color="auto" w:fill="E6ECF4"/>
           </w:tcPr>
           <w:p>
@@ -8589,7 +11013,7 @@
         </w:tc>
         <w:tc>
           <w:tcPr>
-            <w:tcW w:type="dxa" w:w="5230"/>
+            <w:tcW w:type="dxa" w:w="5249"/>
             <w:shd w:val="clear" w:color="auto" w:fill="E6ECF4"/>
           </w:tcPr>
           <w:p>
@@ -8607,7 +11031,7 @@
         </w:tc>
         <w:tc>
           <w:tcPr>
-            <w:tcW w:type="dxa" w:w="1484"/>
+            <w:tcW w:type="dxa" w:w="1465"/>
             <w:shd w:val="clear" w:color="auto" w:fill="E6ECF4"/>
           </w:tcPr>
           <w:p>
@@ -8625,7 +11049,7 @@
         </w:tc>
         <w:tc>
           <w:tcPr>
-            <w:tcW w:type="dxa" w:w="911"/>
+            <w:tcW w:type="dxa" w:w="913"/>
             <w:shd w:val="clear" w:color="auto" w:fill="E6ECF4"/>
           </w:tcPr>
           <w:p>
@@ -8648,7 +11072,7 @@
         </w:trPr>
         <w:tc>
           <w:tcPr>
-            <w:tcW w:type="dxa" w:w="2013"/>
+            <w:tcW w:type="dxa" w:w="2011"/>
           </w:tcPr>
           <w:p>
             <w:pPr>
@@ -8665,7 +11089,7 @@
         </w:tc>
         <w:tc>
           <w:tcPr>
-            <w:tcW w:type="dxa" w:w="5230"/>
+            <w:tcW w:type="dxa" w:w="5249"/>
           </w:tcPr>
           <w:p>
             <w:pPr>
@@ -8681,7 +11105,7 @@
         </w:tc>
         <w:tc>
           <w:tcPr>
-            <w:tcW w:type="dxa" w:w="1484"/>
+            <w:tcW w:type="dxa" w:w="1465"/>
           </w:tcPr>
           <w:p>
             <w:pPr>
@@ -8697,7 +11121,7 @@
         </w:tc>
         <w:tc>
           <w:tcPr>
-            <w:tcW w:type="dxa" w:w="911"/>
+            <w:tcW w:type="dxa" w:w="913"/>
           </w:tcPr>
           <w:p>
             <w:pPr>
@@ -8718,7 +11142,7 @@
         </w:trPr>
         <w:tc>
           <w:tcPr>
-            <w:tcW w:type="dxa" w:w="2013"/>
+            <w:tcW w:type="dxa" w:w="2011"/>
           </w:tcPr>
           <w:p>
             <w:pPr>
@@ -8735,7 +11159,7 @@
         </w:tc>
         <w:tc>
           <w:tcPr>
-            <w:tcW w:type="dxa" w:w="5230"/>
+            <w:tcW w:type="dxa" w:w="5249"/>
           </w:tcPr>
           <w:p>
             <w:pPr>
@@ -8751,7 +11175,7 @@
         </w:tc>
         <w:tc>
           <w:tcPr>
-            <w:tcW w:type="dxa" w:w="1484"/>
+            <w:tcW w:type="dxa" w:w="1465"/>
           </w:tcPr>
           <w:p>
             <w:pPr>
@@ -8767,7 +11191,7 @@
         </w:tc>
         <w:tc>
           <w:tcPr>
-            <w:tcW w:type="dxa" w:w="911"/>
+            <w:tcW w:type="dxa" w:w="913"/>
           </w:tcPr>
           <w:p>
             <w:pPr>
@@ -8788,7 +11212,7 @@
         </w:trPr>
         <w:tc>
           <w:tcPr>
-            <w:tcW w:type="dxa" w:w="2013"/>
+            <w:tcW w:type="dxa" w:w="2011"/>
           </w:tcPr>
           <w:p>
             <w:pPr>
@@ -8805,7 +11229,7 @@
         </w:tc>
         <w:tc>
           <w:tcPr>
-            <w:tcW w:type="dxa" w:w="5230"/>
+            <w:tcW w:type="dxa" w:w="5249"/>
           </w:tcPr>
           <w:p>
             <w:pPr>
@@ -8821,7 +11245,7 @@
         </w:tc>
         <w:tc>
           <w:tcPr>
-            <w:tcW w:type="dxa" w:w="1484"/>
+            <w:tcW w:type="dxa" w:w="1465"/>
           </w:tcPr>
           <w:p>
             <w:pPr>
@@ -8837,7 +11261,7 @@
         </w:tc>
         <w:tc>
           <w:tcPr>
-            <w:tcW w:type="dxa" w:w="911"/>
+            <w:tcW w:type="dxa" w:w="913"/>
           </w:tcPr>
           <w:p>
             <w:pPr>
@@ -8858,7 +11282,7 @@
         </w:trPr>
         <w:tc>
           <w:tcPr>
-            <w:tcW w:type="dxa" w:w="2013"/>
+            <w:tcW w:type="dxa" w:w="2011"/>
           </w:tcPr>
           <w:p>
             <w:pPr>
@@ -8875,7 +11299,7 @@
         </w:tc>
         <w:tc>
           <w:tcPr>
-            <w:tcW w:type="dxa" w:w="5230"/>
+            <w:tcW w:type="dxa" w:w="5249"/>
           </w:tcPr>
           <w:p>
             <w:pPr>
@@ -8891,7 +11315,7 @@
         </w:tc>
         <w:tc>
           <w:tcPr>
-            <w:tcW w:type="dxa" w:w="1484"/>
+            <w:tcW w:type="dxa" w:w="1465"/>
           </w:tcPr>
           <w:p>
             <w:pPr>
@@ -8907,7 +11331,7 @@
         </w:tc>
         <w:tc>
           <w:tcPr>
-            <w:tcW w:type="dxa" w:w="911"/>
+            <w:tcW w:type="dxa" w:w="913"/>
           </w:tcPr>
           <w:p>
             <w:pPr>
@@ -8928,7 +11352,7 @@
         </w:trPr>
         <w:tc>
           <w:tcPr>
-            <w:tcW w:type="dxa" w:w="2013"/>
+            <w:tcW w:type="dxa" w:w="2011"/>
           </w:tcPr>
           <w:p>
             <w:pPr>
@@ -8945,7 +11369,7 @@
         </w:tc>
         <w:tc>
           <w:tcPr>
-            <w:tcW w:type="dxa" w:w="5230"/>
+            <w:tcW w:type="dxa" w:w="5249"/>
           </w:tcPr>
           <w:p>
             <w:pPr>
@@ -8961,7 +11385,7 @@
         </w:tc>
         <w:tc>
           <w:tcPr>
-            <w:tcW w:type="dxa" w:w="1484"/>
+            <w:tcW w:type="dxa" w:w="1465"/>
           </w:tcPr>
           <w:p>
             <w:pPr>
@@ -8977,7 +11401,7 @@
         </w:tc>
         <w:tc>
           <w:tcPr>
-            <w:tcW w:type="dxa" w:w="911"/>
+            <w:tcW w:type="dxa" w:w="913"/>
           </w:tcPr>
           <w:p>
             <w:pPr>
@@ -8998,7 +11422,7 @@
         </w:trPr>
         <w:tc>
           <w:tcPr>
-            <w:tcW w:type="dxa" w:w="2013"/>
+            <w:tcW w:type="dxa" w:w="2011"/>
           </w:tcPr>
           <w:p>
             <w:pPr>
@@ -9009,13 +11433,13 @@
                 <w:b/>
                 <w:sz w:val="19"/>
               </w:rPr>
-              <w:t>Decision architecture</w:t>
-            </w:r>
-          </w:p>
-        </w:tc>
-        <w:tc>
-          <w:tcPr>
-            <w:tcW w:type="dxa" w:w="5230"/>
+              <w:t>Dark pattern</w:t>
+            </w:r>
+          </w:p>
+        </w:tc>
+        <w:tc>
+          <w:tcPr>
+            <w:tcW w:type="dxa" w:w="5249"/>
           </w:tcPr>
           <w:p>
             <w:pPr>
@@ -9025,13 +11449,13 @@
               <w:rPr>
                 <w:sz w:val="19"/>
               </w:rPr>
-              <w:t>A set of connected decisions that are made on purpose and written down: what effect you want, what comes first, who decides and how conflicts are settled. It replaces many separate fixes.</w:t>
-            </w:r>
-          </w:p>
-        </w:tc>
-        <w:tc>
-          <w:tcPr>
-            <w:tcW w:type="dxa" w:w="1484"/>
+              <w:t>A design that uses emotion against people's own interest, such as false urgency, guilt or hidden costs.</w:t>
+            </w:r>
+          </w:p>
+        </w:tc>
+        <w:tc>
+          <w:tcPr>
+            <w:tcW w:type="dxa" w:w="1465"/>
           </w:tcPr>
           <w:p>
             <w:pPr>
@@ -9047,7 +11471,7 @@
         </w:tc>
         <w:tc>
           <w:tcPr>
-            <w:tcW w:type="dxa" w:w="911"/>
+            <w:tcW w:type="dxa" w:w="913"/>
           </w:tcPr>
           <w:p>
             <w:pPr>
@@ -9057,7 +11481,7 @@
               <w:rPr>
                 <w:sz w:val="19"/>
               </w:rPr>
-              <w:t>Day 1</w:t>
+              <w:t>Day 7</w:t>
             </w:r>
           </w:p>
         </w:tc>
@@ -9068,7 +11492,7 @@
         </w:trPr>
         <w:tc>
           <w:tcPr>
-            <w:tcW w:type="dxa" w:w="2013"/>
+            <w:tcW w:type="dxa" w:w="2011"/>
           </w:tcPr>
           <w:p>
             <w:pPr>
@@ -9079,13 +11503,13 @@
                 <w:b/>
                 <w:sz w:val="19"/>
               </w:rPr>
-              <w:t>Design logic</w:t>
-            </w:r>
-          </w:p>
-        </w:tc>
-        <w:tc>
-          <w:tcPr>
-            <w:tcW w:type="dxa" w:w="5230"/>
+              <w:t>Decision architecture</w:t>
+            </w:r>
+          </w:p>
+        </w:tc>
+        <w:tc>
+          <w:tcPr>
+            <w:tcW w:type="dxa" w:w="5249"/>
           </w:tcPr>
           <w:p>
             <w:pPr>
@@ -9095,13 +11519,13 @@
               <w:rPr>
                 <w:sz w:val="19"/>
               </w:rPr>
-              <w:t>A set of decided rules and shared components, such as which colour means what and which type levels exist, used for every screen so everything stays consistent.</w:t>
-            </w:r>
-          </w:p>
-        </w:tc>
-        <w:tc>
-          <w:tcPr>
-            <w:tcW w:type="dxa" w:w="1484"/>
+              <w:t>A set of connected decisions that are made on purpose and written down: what effect you want, what comes first, who decides and how conflicts are settled. It replaces many separate fixes.</w:t>
+            </w:r>
+          </w:p>
+        </w:tc>
+        <w:tc>
+          <w:tcPr>
+            <w:tcW w:type="dxa" w:w="1465"/>
           </w:tcPr>
           <w:p>
             <w:pPr>
@@ -9117,7 +11541,7 @@
         </w:tc>
         <w:tc>
           <w:tcPr>
-            <w:tcW w:type="dxa" w:w="911"/>
+            <w:tcW w:type="dxa" w:w="913"/>
           </w:tcPr>
           <w:p>
             <w:pPr>
@@ -9127,7 +11551,7 @@
               <w:rPr>
                 <w:sz w:val="19"/>
               </w:rPr>
-              <w:t>Day 3</w:t>
+              <w:t>Day 1</w:t>
             </w:r>
           </w:p>
         </w:tc>
@@ -9138,7 +11562,7 @@
         </w:trPr>
         <w:tc>
           <w:tcPr>
-            <w:tcW w:type="dxa" w:w="2013"/>
+            <w:tcW w:type="dxa" w:w="2011"/>
           </w:tcPr>
           <w:p>
             <w:pPr>
@@ -9149,13 +11573,13 @@
                 <w:b/>
                 <w:sz w:val="19"/>
               </w:rPr>
-              <w:t>Dramaturgy</w:t>
-            </w:r>
-          </w:p>
-        </w:tc>
-        <w:tc>
-          <w:tcPr>
-            <w:tcW w:type="dxa" w:w="5230"/>
+              <w:t>Design logic</w:t>
+            </w:r>
+          </w:p>
+        </w:tc>
+        <w:tc>
+          <w:tcPr>
+            <w:tcW w:type="dxa" w:w="5249"/>
           </w:tcPr>
           <w:p>
             <w:pPr>
@@ -9165,13 +11589,13 @@
               <w:rPr>
                 <w:sz w:val="19"/>
               </w:rPr>
-              <w:t>The order and rhythm of a journey: tension, expectation, sequence, transitions, confirmation and emotional context.</w:t>
-            </w:r>
-          </w:p>
-        </w:tc>
-        <w:tc>
-          <w:tcPr>
-            <w:tcW w:type="dxa" w:w="1484"/>
+              <w:t>A set of decided rules and shared components, such as which colour means what and which type levels exist, used for every screen so everything stays consistent.</w:t>
+            </w:r>
+          </w:p>
+        </w:tc>
+        <w:tc>
+          <w:tcPr>
+            <w:tcW w:type="dxa" w:w="1465"/>
           </w:tcPr>
           <w:p>
             <w:pPr>
@@ -9187,7 +11611,7 @@
         </w:tc>
         <w:tc>
           <w:tcPr>
-            <w:tcW w:type="dxa" w:w="911"/>
+            <w:tcW w:type="dxa" w:w="913"/>
           </w:tcPr>
           <w:p>
             <w:pPr>
@@ -9197,7 +11621,7 @@
               <w:rPr>
                 <w:sz w:val="19"/>
               </w:rPr>
-              <w:t>Day 8</w:t>
+              <w:t>Day 3</w:t>
             </w:r>
           </w:p>
         </w:tc>
@@ -9208,7 +11632,7 @@
         </w:trPr>
         <w:tc>
           <w:tcPr>
-            <w:tcW w:type="dxa" w:w="2013"/>
+            <w:tcW w:type="dxa" w:w="2011"/>
           </w:tcPr>
           <w:p>
             <w:pPr>
@@ -9219,13 +11643,13 @@
                 <w:b/>
                 <w:sz w:val="19"/>
               </w:rPr>
-              <w:t>Emotional bond</w:t>
-            </w:r>
-          </w:p>
-        </w:tc>
-        <w:tc>
-          <w:tcPr>
-            <w:tcW w:type="dxa" w:w="5230"/>
+              <w:t>Dramaturgy</w:t>
+            </w:r>
+          </w:p>
+        </w:tc>
+        <w:tc>
+          <w:tcPr>
+            <w:tcW w:type="dxa" w:w="5249"/>
           </w:tcPr>
           <w:p>
             <w:pPr>
@@ -9235,13 +11659,13 @@
               <w:rPr>
                 <w:sz w:val="19"/>
               </w:rPr>
-              <w:t>The sense, built over time, that a product is on your side. It makes people trust it and come back.</w:t>
-            </w:r>
-          </w:p>
-        </w:tc>
-        <w:tc>
-          <w:tcPr>
-            <w:tcW w:type="dxa" w:w="1484"/>
+              <w:t>The order and rhythm of a journey: tension, expectation, sequence, transitions, confirmation and emotional context.</w:t>
+            </w:r>
+          </w:p>
+        </w:tc>
+        <w:tc>
+          <w:tcPr>
+            <w:tcW w:type="dxa" w:w="1465"/>
           </w:tcPr>
           <w:p>
             <w:pPr>
@@ -9257,7 +11681,7 @@
         </w:tc>
         <w:tc>
           <w:tcPr>
-            <w:tcW w:type="dxa" w:w="911"/>
+            <w:tcW w:type="dxa" w:w="913"/>
           </w:tcPr>
           <w:p>
             <w:pPr>
@@ -9267,7 +11691,7 @@
               <w:rPr>
                 <w:sz w:val="19"/>
               </w:rPr>
-              <w:t>Day 7</w:t>
+              <w:t>Day 8</w:t>
             </w:r>
           </w:p>
         </w:tc>
@@ -9278,7 +11702,7 @@
         </w:trPr>
         <w:tc>
           <w:tcPr>
-            <w:tcW w:type="dxa" w:w="2013"/>
+            <w:tcW w:type="dxa" w:w="2011"/>
           </w:tcPr>
           <w:p>
             <w:pPr>
@@ -9289,13 +11713,13 @@
                 <w:b/>
                 <w:sz w:val="19"/>
               </w:rPr>
-              <w:t>Experience quality</w:t>
-            </w:r>
-          </w:p>
-        </w:tc>
-        <w:tc>
-          <w:tcPr>
-            <w:tcW w:type="dxa" w:w="5230"/>
+              <w:t>Emotional bond</w:t>
+            </w:r>
+          </w:p>
+        </w:tc>
+        <w:tc>
+          <w:tcPr>
+            <w:tcW w:type="dxa" w:w="5249"/>
           </w:tcPr>
           <w:p>
             <w:pPr>
@@ -9305,13 +11729,13 @@
               <w:rPr>
                 <w:sz w:val="19"/>
               </w:rPr>
-              <w:t>How using a product feels, on the way and afterwards. It goes beyond usability, which only asks whether people reach their goal.</w:t>
-            </w:r>
-          </w:p>
-        </w:tc>
-        <w:tc>
-          <w:tcPr>
-            <w:tcW w:type="dxa" w:w="1484"/>
+              <w:t>The sense, built over time, that a product is on your side. It makes people trust it and come back.</w:t>
+            </w:r>
+          </w:p>
+        </w:tc>
+        <w:tc>
+          <w:tcPr>
+            <w:tcW w:type="dxa" w:w="1465"/>
           </w:tcPr>
           <w:p>
             <w:pPr>
@@ -9327,7 +11751,7 @@
         </w:tc>
         <w:tc>
           <w:tcPr>
-            <w:tcW w:type="dxa" w:w="911"/>
+            <w:tcW w:type="dxa" w:w="913"/>
           </w:tcPr>
           <w:p>
             <w:pPr>
@@ -9348,7 +11772,7 @@
         </w:trPr>
         <w:tc>
           <w:tcPr>
-            <w:tcW w:type="dxa" w:w="2013"/>
+            <w:tcW w:type="dxa" w:w="2011"/>
           </w:tcPr>
           <w:p>
             <w:pPr>
@@ -9359,13 +11783,13 @@
                 <w:b/>
                 <w:sz w:val="19"/>
               </w:rPr>
-              <w:t>Goal-gradient effect</w:t>
-            </w:r>
-          </w:p>
-        </w:tc>
-        <w:tc>
-          <w:tcPr>
-            <w:tcW w:type="dxa" w:w="5230"/>
+              <w:t>Experience quality</w:t>
+            </w:r>
+          </w:p>
+        </w:tc>
+        <w:tc>
+          <w:tcPr>
+            <w:tcW w:type="dxa" w:w="5249"/>
           </w:tcPr>
           <w:p>
             <w:pPr>
@@ -9375,13 +11799,13 @@
               <w:rPr>
                 <w:sz w:val="19"/>
               </w:rPr>
-              <w:t>People speed up and keep going as they see themselves getting closer to a goal.</w:t>
-            </w:r>
-          </w:p>
-        </w:tc>
-        <w:tc>
-          <w:tcPr>
-            <w:tcW w:type="dxa" w:w="1484"/>
+              <w:t>How using a product feels, on the way and afterwards. It goes beyond usability, which only asks whether people reach their goal.</w:t>
+            </w:r>
+          </w:p>
+        </w:tc>
+        <w:tc>
+          <w:tcPr>
+            <w:tcW w:type="dxa" w:w="1465"/>
           </w:tcPr>
           <w:p>
             <w:pPr>
@@ -9397,7 +11821,7 @@
         </w:tc>
         <w:tc>
           <w:tcPr>
-            <w:tcW w:type="dxa" w:w="911"/>
+            <w:tcW w:type="dxa" w:w="913"/>
           </w:tcPr>
           <w:p>
             <w:pPr>
@@ -9407,7 +11831,7 @@
               <w:rPr>
                 <w:sz w:val="19"/>
               </w:rPr>
-              <w:t>Day 8</w:t>
+              <w:t>Day 7</w:t>
             </w:r>
           </w:p>
         </w:tc>
@@ -9418,7 +11842,7 @@
         </w:trPr>
         <w:tc>
           <w:tcPr>
-            <w:tcW w:type="dxa" w:w="2013"/>
+            <w:tcW w:type="dxa" w:w="2011"/>
           </w:tcPr>
           <w:p>
             <w:pPr>
@@ -9429,13 +11853,13 @@
                 <w:b/>
                 <w:sz w:val="19"/>
               </w:rPr>
-              <w:t>Governance</w:t>
-            </w:r>
-          </w:p>
-        </w:tc>
-        <w:tc>
-          <w:tcPr>
-            <w:tcW w:type="dxa" w:w="5230"/>
+              <w:t>Goal-gradient effect</w:t>
+            </w:r>
+          </w:p>
+        </w:tc>
+        <w:tc>
+          <w:tcPr>
+            <w:tcW w:type="dxa" w:w="5249"/>
           </w:tcPr>
           <w:p>
             <w:pPr>
@@ -9445,13 +11869,13 @@
               <w:rPr>
                 <w:sz w:val="19"/>
               </w:rPr>
-              <w:t>The rules about who may decide what, who is answerable for it and how disagreements are settled.</w:t>
-            </w:r>
-          </w:p>
-        </w:tc>
-        <w:tc>
-          <w:tcPr>
-            <w:tcW w:type="dxa" w:w="1484"/>
+              <w:t>People speed up and keep going as they see themselves getting closer to a goal.</w:t>
+            </w:r>
+          </w:p>
+        </w:tc>
+        <w:tc>
+          <w:tcPr>
+            <w:tcW w:type="dxa" w:w="1465"/>
           </w:tcPr>
           <w:p>
             <w:pPr>
@@ -9467,7 +11891,7 @@
         </w:tc>
         <w:tc>
           <w:tcPr>
-            <w:tcW w:type="dxa" w:w="911"/>
+            <w:tcW w:type="dxa" w:w="913"/>
           </w:tcPr>
           <w:p>
             <w:pPr>
@@ -9477,7 +11901,7 @@
               <w:rPr>
                 <w:sz w:val="19"/>
               </w:rPr>
-              <w:t>Day 1</w:t>
+              <w:t>Day 8</w:t>
             </w:r>
           </w:p>
         </w:tc>
@@ -9488,7 +11912,7 @@
         </w:trPr>
         <w:tc>
           <w:tcPr>
-            <w:tcW w:type="dxa" w:w="2013"/>
+            <w:tcW w:type="dxa" w:w="2011"/>
           </w:tcPr>
           <w:p>
             <w:pPr>
@@ -9499,13 +11923,13 @@
                 <w:b/>
                 <w:sz w:val="19"/>
               </w:rPr>
-              <w:t>Hypothesis</w:t>
-            </w:r>
-          </w:p>
-        </w:tc>
-        <w:tc>
-          <w:tcPr>
-            <w:tcW w:type="dxa" w:w="5230"/>
+              <w:t>Governance</w:t>
+            </w:r>
+          </w:p>
+        </w:tc>
+        <w:tc>
+          <w:tcPr>
+            <w:tcW w:type="dxa" w:w="5249"/>
           </w:tcPr>
           <w:p>
             <w:pPr>
@@ -9515,13 +11939,13 @@
               <w:rPr>
                 <w:sz w:val="19"/>
               </w:rPr>
-              <w:t>An assumption you could check later. “This red banner could make users uneasy” is a hypothesis; “this banner is bad” is only an opinion.</w:t>
-            </w:r>
-          </w:p>
-        </w:tc>
-        <w:tc>
-          <w:tcPr>
-            <w:tcW w:type="dxa" w:w="1484"/>
+              <w:t>The rules about who may decide what, who is answerable for it and how disagreements are settled.</w:t>
+            </w:r>
+          </w:p>
+        </w:tc>
+        <w:tc>
+          <w:tcPr>
+            <w:tcW w:type="dxa" w:w="1465"/>
           </w:tcPr>
           <w:p>
             <w:pPr>
@@ -9537,7 +11961,7 @@
         </w:tc>
         <w:tc>
           <w:tcPr>
-            <w:tcW w:type="dxa" w:w="911"/>
+            <w:tcW w:type="dxa" w:w="913"/>
           </w:tcPr>
           <w:p>
             <w:pPr>
@@ -9558,7 +11982,7 @@
         </w:trPr>
         <w:tc>
           <w:tcPr>
-            <w:tcW w:type="dxa" w:w="2013"/>
+            <w:tcW w:type="dxa" w:w="2011"/>
           </w:tcPr>
           <w:p>
             <w:pPr>
@@ -9569,13 +11993,13 @@
                 <w:b/>
                 <w:sz w:val="19"/>
               </w:rPr>
-              <w:t>Narrative guidance</w:t>
-            </w:r>
-          </w:p>
-        </w:tc>
-        <w:tc>
-          <w:tcPr>
-            <w:tcW w:type="dxa" w:w="5230"/>
+              <w:t>Hypothesis</w:t>
+            </w:r>
+          </w:p>
+        </w:tc>
+        <w:tc>
+          <w:tcPr>
+            <w:tcW w:type="dxa" w:w="5249"/>
           </w:tcPr>
           <w:p>
             <w:pPr>
@@ -9585,13 +12009,13 @@
               <w:rPr>
                 <w:sz w:val="19"/>
               </w:rPr>
-              <w:t>Guiding people through a process as a journey: where they start, where they are going, why it matters, how far they have come and when they are done.</w:t>
-            </w:r>
-          </w:p>
-        </w:tc>
-        <w:tc>
-          <w:tcPr>
-            <w:tcW w:type="dxa" w:w="1484"/>
+              <w:t>An assumption you could check later. “This red banner could make users uneasy” is a hypothesis; “this banner is bad” is only an opinion.</w:t>
+            </w:r>
+          </w:p>
+        </w:tc>
+        <w:tc>
+          <w:tcPr>
+            <w:tcW w:type="dxa" w:w="1465"/>
           </w:tcPr>
           <w:p>
             <w:pPr>
@@ -9607,7 +12031,7 @@
         </w:tc>
         <w:tc>
           <w:tcPr>
-            <w:tcW w:type="dxa" w:w="911"/>
+            <w:tcW w:type="dxa" w:w="913"/>
           </w:tcPr>
           <w:p>
             <w:pPr>
@@ -9617,7 +12041,7 @@
               <w:rPr>
                 <w:sz w:val="19"/>
               </w:rPr>
-              <w:t>Day 8</w:t>
+              <w:t>Day 1</w:t>
             </w:r>
           </w:p>
         </w:tc>
@@ -9628,7 +12052,7 @@
         </w:trPr>
         <w:tc>
           <w:tcPr>
-            <w:tcW w:type="dxa" w:w="2013"/>
+            <w:tcW w:type="dxa" w:w="2011"/>
           </w:tcPr>
           <w:p>
             <w:pPr>
@@ -9639,13 +12063,13 @@
                 <w:b/>
                 <w:sz w:val="19"/>
               </w:rPr>
-              <w:t>Neuro-UX</w:t>
-            </w:r>
-          </w:p>
-        </w:tc>
-        <w:tc>
-          <w:tcPr>
-            <w:tcW w:type="dxa" w:w="5230"/>
+              <w:t>Narrative guidance</w:t>
+            </w:r>
+          </w:p>
+        </w:tc>
+        <w:tc>
+          <w:tcPr>
+            <w:tcW w:type="dxa" w:w="5249"/>
           </w:tcPr>
           <w:p>
             <w:pPr>
@@ -9655,13 +12079,13 @@
               <w:rPr>
                 <w:sz w:val="19"/>
               </w:rPr>
-              <w:t>Designing an interface with knowledge of how the brain sees, attends, feels and decides, so that the design steers these processes on purpose and responsibly.</w:t>
-            </w:r>
-          </w:p>
-        </w:tc>
-        <w:tc>
-          <w:tcPr>
-            <w:tcW w:type="dxa" w:w="1484"/>
+              <w:t>Guiding people through a process as a journey: where they start, where they are going, why it matters, how far they have come and when they are done.</w:t>
+            </w:r>
+          </w:p>
+        </w:tc>
+        <w:tc>
+          <w:tcPr>
+            <w:tcW w:type="dxa" w:w="1465"/>
           </w:tcPr>
           <w:p>
             <w:pPr>
@@ -9677,7 +12101,7 @@
         </w:tc>
         <w:tc>
           <w:tcPr>
-            <w:tcW w:type="dxa" w:w="911"/>
+            <w:tcW w:type="dxa" w:w="913"/>
           </w:tcPr>
           <w:p>
             <w:pPr>
@@ -9687,7 +12111,7 @@
               <w:rPr>
                 <w:sz w:val="19"/>
               </w:rPr>
-              <w:t>Day 1</w:t>
+              <w:t>Day 8</w:t>
             </w:r>
           </w:p>
         </w:tc>
@@ -9698,7 +12122,7 @@
         </w:trPr>
         <w:tc>
           <w:tcPr>
-            <w:tcW w:type="dxa" w:w="2013"/>
+            <w:tcW w:type="dxa" w:w="2011"/>
           </w:tcPr>
           <w:p>
             <w:pPr>
@@ -9709,13 +12133,13 @@
                 <w:b/>
                 <w:sz w:val="19"/>
               </w:rPr>
-              <w:t>Onboarding</w:t>
-            </w:r>
-          </w:p>
-        </w:tc>
-        <w:tc>
-          <w:tcPr>
-            <w:tcW w:type="dxa" w:w="5230"/>
+              <w:t>Neuro-UX</w:t>
+            </w:r>
+          </w:p>
+        </w:tc>
+        <w:tc>
+          <w:tcPr>
+            <w:tcW w:type="dxa" w:w="5249"/>
           </w:tcPr>
           <w:p>
             <w:pPr>
@@ -9725,13 +12149,13 @@
               <w:rPr>
                 <w:sz w:val="19"/>
               </w:rPr>
-              <w:t>The first journey with a product, from signing up to being ready to use it.</w:t>
-            </w:r>
-          </w:p>
-        </w:tc>
-        <w:tc>
-          <w:tcPr>
-            <w:tcW w:type="dxa" w:w="1484"/>
+              <w:t>Designing an interface with knowledge of how the brain sees, attends, feels and decides, so that the design steers these processes on purpose and responsibly.</w:t>
+            </w:r>
+          </w:p>
+        </w:tc>
+        <w:tc>
+          <w:tcPr>
+            <w:tcW w:type="dxa" w:w="1465"/>
           </w:tcPr>
           <w:p>
             <w:pPr>
@@ -9747,7 +12171,7 @@
         </w:tc>
         <w:tc>
           <w:tcPr>
-            <w:tcW w:type="dxa" w:w="911"/>
+            <w:tcW w:type="dxa" w:w="913"/>
           </w:tcPr>
           <w:p>
             <w:pPr>
@@ -9757,7 +12181,7 @@
               <w:rPr>
                 <w:sz w:val="19"/>
               </w:rPr>
-              <w:t>Day 8</w:t>
+              <w:t>Day 1</w:t>
             </w:r>
           </w:p>
         </w:tc>
@@ -9768,7 +12192,7 @@
         </w:trPr>
         <w:tc>
           <w:tcPr>
-            <w:tcW w:type="dxa" w:w="2013"/>
+            <w:tcW w:type="dxa" w:w="2011"/>
           </w:tcPr>
           <w:p>
             <w:pPr>
@@ -9779,13 +12203,13 @@
                 <w:b/>
                 <w:sz w:val="19"/>
               </w:rPr>
-              <w:t>Orientation</w:t>
-            </w:r>
-          </w:p>
-        </w:tc>
-        <w:tc>
-          <w:tcPr>
-            <w:tcW w:type="dxa" w:w="5230"/>
+              <w:t>Onboarding</w:t>
+            </w:r>
+          </w:p>
+        </w:tc>
+        <w:tc>
+          <w:tcPr>
+            <w:tcW w:type="dxa" w:w="5249"/>
           </w:tcPr>
           <w:p>
             <w:pPr>
@@ -9795,13 +12219,13 @@
               <w:rPr>
                 <w:sz w:val="19"/>
               </w:rPr>
-              <w:t>Knowing where you are, what you can do here and what happens next.</w:t>
-            </w:r>
-          </w:p>
-        </w:tc>
-        <w:tc>
-          <w:tcPr>
-            <w:tcW w:type="dxa" w:w="1484"/>
+              <w:t>The first journey with a product, from signing up to being ready to use it.</w:t>
+            </w:r>
+          </w:p>
+        </w:tc>
+        <w:tc>
+          <w:tcPr>
+            <w:tcW w:type="dxa" w:w="1465"/>
           </w:tcPr>
           <w:p>
             <w:pPr>
@@ -9817,7 +12241,7 @@
         </w:tc>
         <w:tc>
           <w:tcPr>
-            <w:tcW w:type="dxa" w:w="911"/>
+            <w:tcW w:type="dxa" w:w="913"/>
           </w:tcPr>
           <w:p>
             <w:pPr>
@@ -9827,7 +12251,7 @@
               <w:rPr>
                 <w:sz w:val="19"/>
               </w:rPr>
-              <w:t>Day 1</w:t>
+              <w:t>Day 8</w:t>
             </w:r>
           </w:p>
         </w:tc>
@@ -9838,7 +12262,7 @@
         </w:trPr>
         <w:tc>
           <w:tcPr>
-            <w:tcW w:type="dxa" w:w="2013"/>
+            <w:tcW w:type="dxa" w:w="2011"/>
           </w:tcPr>
           <w:p>
             <w:pPr>
@@ -9849,13 +12273,13 @@
                 <w:b/>
                 <w:sz w:val="19"/>
               </w:rPr>
-              <w:t>Storytelling in UX</w:t>
-            </w:r>
-          </w:p>
-        </w:tc>
-        <w:tc>
-          <w:tcPr>
-            <w:tcW w:type="dxa" w:w="5230"/>
+              <w:t>Orientation</w:t>
+            </w:r>
+          </w:p>
+        </w:tc>
+        <w:tc>
+          <w:tcPr>
+            <w:tcW w:type="dxa" w:w="5249"/>
           </w:tcPr>
           <w:p>
             <w:pPr>
@@ -9865,13 +12289,13 @@
               <w:rPr>
                 <w:sz w:val="19"/>
               </w:rPr>
-              <w:t>Building a digital journey so it has what a story has: a beginning that shows the goal, a way that shows progress, and an end that feels like an end.</w:t>
-            </w:r>
-          </w:p>
-        </w:tc>
-        <w:tc>
-          <w:tcPr>
-            <w:tcW w:type="dxa" w:w="1484"/>
+              <w:t>Knowing where you are, what you can do here and what happens next.</w:t>
+            </w:r>
+          </w:p>
+        </w:tc>
+        <w:tc>
+          <w:tcPr>
+            <w:tcW w:type="dxa" w:w="1465"/>
           </w:tcPr>
           <w:p>
             <w:pPr>
@@ -9887,7 +12311,7 @@
         </w:tc>
         <w:tc>
           <w:tcPr>
-            <w:tcW w:type="dxa" w:w="911"/>
+            <w:tcW w:type="dxa" w:w="913"/>
           </w:tcPr>
           <w:p>
             <w:pPr>
@@ -9897,7 +12321,7 @@
               <w:rPr>
                 <w:sz w:val="19"/>
               </w:rPr>
-              <w:t>Day 8</w:t>
+              <w:t>Day 1</w:t>
             </w:r>
           </w:p>
         </w:tc>
@@ -9908,7 +12332,7 @@
         </w:trPr>
         <w:tc>
           <w:tcPr>
-            <w:tcW w:type="dxa" w:w="2013"/>
+            <w:tcW w:type="dxa" w:w="2011"/>
           </w:tcPr>
           <w:p>
             <w:pPr>
@@ -9919,13 +12343,13 @@
                 <w:b/>
                 <w:sz w:val="19"/>
               </w:rPr>
-              <w:t>Touchpoint</w:t>
-            </w:r>
-          </w:p>
-        </w:tc>
-        <w:tc>
-          <w:tcPr>
-            <w:tcW w:type="dxa" w:w="5230"/>
+              <w:t>Storytelling in UX</w:t>
+            </w:r>
+          </w:p>
+        </w:tc>
+        <w:tc>
+          <w:tcPr>
+            <w:tcW w:type="dxa" w:w="5249"/>
           </w:tcPr>
           <w:p>
             <w:pPr>
@@ -9935,13 +12359,13 @@
               <w:rPr>
                 <w:sz w:val="19"/>
               </w:rPr>
-              <w:t>Any place where a person meets the company: the website, the customer portal, the app, a chatbot or a phone call.</w:t>
-            </w:r>
-          </w:p>
-        </w:tc>
-        <w:tc>
-          <w:tcPr>
-            <w:tcW w:type="dxa" w:w="1484"/>
+              <w:t>Building a digital journey so it has what a story has: a beginning that shows the goal, a way that shows progress, and an end that feels like an end.</w:t>
+            </w:r>
+          </w:p>
+        </w:tc>
+        <w:tc>
+          <w:tcPr>
+            <w:tcW w:type="dxa" w:w="1465"/>
           </w:tcPr>
           <w:p>
             <w:pPr>
@@ -9957,7 +12381,7 @@
         </w:tc>
         <w:tc>
           <w:tcPr>
-            <w:tcW w:type="dxa" w:w="911"/>
+            <w:tcW w:type="dxa" w:w="913"/>
           </w:tcPr>
           <w:p>
             <w:pPr>
@@ -9967,7 +12391,7 @@
               <w:rPr>
                 <w:sz w:val="19"/>
               </w:rPr>
-              <w:t>Day 1</w:t>
+              <w:t>Day 8</w:t>
             </w:r>
           </w:p>
         </w:tc>
@@ -9978,7 +12402,7 @@
         </w:trPr>
         <w:tc>
           <w:tcPr>
-            <w:tcW w:type="dxa" w:w="2013"/>
+            <w:tcW w:type="dxa" w:w="2011"/>
           </w:tcPr>
           <w:p>
             <w:pPr>
@@ -9989,13 +12413,13 @@
                 <w:b/>
                 <w:sz w:val="19"/>
               </w:rPr>
-              <w:t>Transition</w:t>
-            </w:r>
-          </w:p>
-        </w:tc>
-        <w:tc>
-          <w:tcPr>
-            <w:tcW w:type="dxa" w:w="5230"/>
+              <w:t>Tone guide</w:t>
+            </w:r>
+          </w:p>
+        </w:tc>
+        <w:tc>
+          <w:tcPr>
+            <w:tcW w:type="dxa" w:w="5249"/>
           </w:tcPr>
           <w:p>
             <w:pPr>
@@ -10005,13 +12429,13 @@
               <w:rPr>
                 <w:sz w:val="19"/>
               </w:rPr>
-              <w:t>The moment between two steps: what was done, what comes next and why.</w:t>
-            </w:r>
-          </w:p>
-        </w:tc>
-        <w:tc>
-          <w:tcPr>
-            <w:tcW w:type="dxa" w:w="1484"/>
+              <w:t>A short written rule for how a product speaks: which words, how formal, how it sounds when something goes wrong.</w:t>
+            </w:r>
+          </w:p>
+        </w:tc>
+        <w:tc>
+          <w:tcPr>
+            <w:tcW w:type="dxa" w:w="1465"/>
           </w:tcPr>
           <w:p>
             <w:pPr>
@@ -10027,7 +12451,7 @@
         </w:tc>
         <w:tc>
           <w:tcPr>
-            <w:tcW w:type="dxa" w:w="911"/>
+            <w:tcW w:type="dxa" w:w="913"/>
           </w:tcPr>
           <w:p>
             <w:pPr>
@@ -10037,7 +12461,7 @@
               <w:rPr>
                 <w:sz w:val="19"/>
               </w:rPr>
-              <w:t>Day 8</w:t>
+              <w:t>Day 7</w:t>
             </w:r>
           </w:p>
         </w:tc>
@@ -10048,7 +12472,7 @@
         </w:trPr>
         <w:tc>
           <w:tcPr>
-            <w:tcW w:type="dxa" w:w="2013"/>
+            <w:tcW w:type="dxa" w:w="2011"/>
           </w:tcPr>
           <w:p>
             <w:pPr>
@@ -10059,13 +12483,13 @@
                 <w:b/>
                 <w:sz w:val="19"/>
               </w:rPr>
-              <w:t>UI (user interface)</w:t>
-            </w:r>
-          </w:p>
-        </w:tc>
-        <w:tc>
-          <w:tcPr>
-            <w:tcW w:type="dxa" w:w="5230"/>
+              <w:t>Touchpoint</w:t>
+            </w:r>
+          </w:p>
+        </w:tc>
+        <w:tc>
+          <w:tcPr>
+            <w:tcW w:type="dxa" w:w="5249"/>
           </w:tcPr>
           <w:p>
             <w:pPr>
@@ -10075,13 +12499,13 @@
               <w:rPr>
                 <w:sz w:val="19"/>
               </w:rPr>
-              <w:t>What a person sees and touches on a screen: buttons, colours, text, icons and their layout. It is the surface of the experience.</w:t>
-            </w:r>
-          </w:p>
-        </w:tc>
-        <w:tc>
-          <w:tcPr>
-            <w:tcW w:type="dxa" w:w="1484"/>
+              <w:t>Any place where a person meets the company: the website, the customer portal, the app, a chatbot or a phone call.</w:t>
+            </w:r>
+          </w:p>
+        </w:tc>
+        <w:tc>
+          <w:tcPr>
+            <w:tcW w:type="dxa" w:w="1465"/>
           </w:tcPr>
           <w:p>
             <w:pPr>
@@ -10091,13 +12515,13 @@
               <w:rPr>
                 <w:sz w:val="19"/>
               </w:rPr>
-              <w:t>Changing a button from grey to blue is a UI change.</w:t>
-            </w:r>
-          </w:p>
-        </w:tc>
-        <w:tc>
-          <w:tcPr>
-            <w:tcW w:type="dxa" w:w="911"/>
+              <w:t>—</w:t>
+            </w:r>
+          </w:p>
+        </w:tc>
+        <w:tc>
+          <w:tcPr>
+            <w:tcW w:type="dxa" w:w="913"/>
           </w:tcPr>
           <w:p>
             <w:pPr>
@@ -10118,7 +12542,7 @@
         </w:trPr>
         <w:tc>
           <w:tcPr>
-            <w:tcW w:type="dxa" w:w="2013"/>
+            <w:tcW w:type="dxa" w:w="2011"/>
           </w:tcPr>
           <w:p>
             <w:pPr>
@@ -10129,13 +12553,153 @@
                 <w:b/>
                 <w:sz w:val="19"/>
               </w:rPr>
+              <w:t>Transition</w:t>
+            </w:r>
+          </w:p>
+        </w:tc>
+        <w:tc>
+          <w:tcPr>
+            <w:tcW w:type="dxa" w:w="5249"/>
+          </w:tcPr>
+          <w:p>
+            <w:pPr>
+              <w:spacing w:before="0" w:after="0"/>
+            </w:pPr>
+            <w:r>
+              <w:rPr>
+                <w:sz w:val="19"/>
+              </w:rPr>
+              <w:t>The moment between two steps: what was done, what comes next and why.</w:t>
+            </w:r>
+          </w:p>
+        </w:tc>
+        <w:tc>
+          <w:tcPr>
+            <w:tcW w:type="dxa" w:w="1465"/>
+          </w:tcPr>
+          <w:p>
+            <w:pPr>
+              <w:spacing w:before="0" w:after="0"/>
+            </w:pPr>
+            <w:r>
+              <w:rPr>
+                <w:sz w:val="19"/>
+              </w:rPr>
+              <w:t>—</w:t>
+            </w:r>
+          </w:p>
+        </w:tc>
+        <w:tc>
+          <w:tcPr>
+            <w:tcW w:type="dxa" w:w="913"/>
+          </w:tcPr>
+          <w:p>
+            <w:pPr>
+              <w:spacing w:before="0" w:after="0"/>
+            </w:pPr>
+            <w:r>
+              <w:rPr>
+                <w:sz w:val="19"/>
+              </w:rPr>
+              <w:t>Day 8</w:t>
+            </w:r>
+          </w:p>
+        </w:tc>
+      </w:tr>
+      <w:tr>
+        <w:trPr>
+          <w:cantSplit/>
+        </w:trPr>
+        <w:tc>
+          <w:tcPr>
+            <w:tcW w:type="dxa" w:w="2011"/>
+          </w:tcPr>
+          <w:p>
+            <w:pPr>
+              <w:spacing w:before="0" w:after="0"/>
+            </w:pPr>
+            <w:r>
+              <w:rPr>
+                <w:b/>
+                <w:sz w:val="19"/>
+              </w:rPr>
+              <w:t>UI (user interface)</w:t>
+            </w:r>
+          </w:p>
+        </w:tc>
+        <w:tc>
+          <w:tcPr>
+            <w:tcW w:type="dxa" w:w="5249"/>
+          </w:tcPr>
+          <w:p>
+            <w:pPr>
+              <w:spacing w:before="0" w:after="0"/>
+            </w:pPr>
+            <w:r>
+              <w:rPr>
+                <w:sz w:val="19"/>
+              </w:rPr>
+              <w:t>What a person sees and touches on a screen: buttons, colours, text, icons and their layout. It is the surface of the experience.</w:t>
+            </w:r>
+          </w:p>
+        </w:tc>
+        <w:tc>
+          <w:tcPr>
+            <w:tcW w:type="dxa" w:w="1465"/>
+          </w:tcPr>
+          <w:p>
+            <w:pPr>
+              <w:spacing w:before="0" w:after="0"/>
+            </w:pPr>
+            <w:r>
+              <w:rPr>
+                <w:sz w:val="19"/>
+              </w:rPr>
+              <w:t>Changing a button from grey to blue is a UI change.</w:t>
+            </w:r>
+          </w:p>
+        </w:tc>
+        <w:tc>
+          <w:tcPr>
+            <w:tcW w:type="dxa" w:w="913"/>
+          </w:tcPr>
+          <w:p>
+            <w:pPr>
+              <w:spacing w:before="0" w:after="0"/>
+            </w:pPr>
+            <w:r>
+              <w:rPr>
+                <w:sz w:val="19"/>
+              </w:rPr>
+              <w:t>Day 1</w:t>
+            </w:r>
+          </w:p>
+        </w:tc>
+      </w:tr>
+      <w:tr>
+        <w:trPr>
+          <w:cantSplit/>
+        </w:trPr>
+        <w:tc>
+          <w:tcPr>
+            <w:tcW w:type="dxa" w:w="2011"/>
+          </w:tcPr>
+          <w:p>
+            <w:pPr>
+              <w:spacing w:before="0" w:after="0"/>
+            </w:pPr>
+            <w:r>
+              <w:rPr>
+                <w:b/>
+                <w:sz w:val="19"/>
+              </w:rPr>
               <w:t>UX (user experience)</w:t>
             </w:r>
           </w:p>
         </w:tc>
         <w:tc>
           <w:tcPr>
-            <w:tcW w:type="dxa" w:w="5230"/>
+            <w:tcW w:type="dxa" w:w="5249"/>
           </w:tcPr>
           <w:p>
             <w:pPr>
@@ -10151,7 +12715,7 @@
         </w:tc>
         <w:tc>
           <w:tcPr>
-            <w:tcW w:type="dxa" w:w="1484"/>
+            <w:tcW w:type="dxa" w:w="1465"/>
           </w:tcPr>
           <w:p>
             <w:pPr>
@@ -10167,7 +12731,7 @@
         </w:tc>
         <w:tc>
           <w:tcPr>
-            <w:tcW w:type="dxa" w:w="911"/>
+            <w:tcW w:type="dxa" w:w="913"/>
           </w:tcPr>
           <w:p>
             <w:pPr>

</xml_diff>